<commit_message>
Add RegMap FastAPI backend with Docker/simulator, and dependency install scripts
Adds backend/ (FastAPI service, Dockerfile, event simulator) as the first
phases of productionizing RegMap, plus install_backend_deps.ps1 and
install_all_deps.ps1 to reproduce the environment on a new machine.
Updates README and exhibit docs to the current repo URL.
</commit_message>
<xml_diff>
--- a/exhibits/Exhibit 12_hybrid _indentity.md.docx
+++ b/exhibits/Exhibit 12_hybrid _indentity.md.docx
@@ -3,35 +3,41 @@
 <w:document xmlns:wpc="http://schemas.microsoft.com/office/word/2010/wordprocessingCanvas" xmlns:cx="http://schemas.microsoft.com/office/drawing/2014/chartex" xmlns:cx1="http://schemas.microsoft.com/office/drawing/2015/9/8/chartex" xmlns:cx2="http://schemas.microsoft.com/office/drawing/2015/10/21/chartex" xmlns:cx3="http://schemas.microsoft.com/office/drawing/2016/5/9/chartex" xmlns:cx4="http://schemas.microsoft.com/office/drawing/2016/5/10/chartex" xmlns:cx5="http://schemas.microsoft.com/office/drawing/2016/5/11/chartex" xmlns:cx6="http://schemas.microsoft.com/office/drawing/2016/5/12/chartex" xmlns:cx7="http://schemas.microsoft.com/office/drawing/2016/5/13/chartex" xmlns:cx8="http://schemas.microsoft.com/office/drawing/2016/5/14/chartex" xmlns:mc="http://schemas.openxmlformats.org/markup-compatibility/2006" xmlns:aink="http://schemas.microsoft.com/office/drawing/2016/ink" xmlns:am3d="http://schemas.microsoft.com/office/drawing/2017/model3d" xmlns:o="urn:schemas-microsoft-com:office:office" xmlns:oel="http://schemas.microsoft.com/office/2019/extlst" xmlns:r="http://schemas.openxmlformats.org/officeDocument/2006/relationships" xmlns:m="http://schemas.openxmlformats.org/officeDocument/2006/math" xmlns:v="urn:schemas-microsoft-com:vml" xmlns:wp14="http://schemas.microsoft.com/office/word/2010/wordprocessingDrawing" xmlns:wp="http://schemas.openxmlformats.org/drawingml/2006/wordprocessingDrawing" xmlns:w10="urn:schemas-microsoft-com:office:word" xmlns:w="http://schemas.openxmlformats.org/wordprocessingml/2006/main" xmlns:w14="http://schemas.microsoft.com/office/word/2010/wordml" xmlns:w15="http://schemas.microsoft.com/office/word/2012/wordml" xmlns:w16cex="http://schemas.microsoft.com/office/word/2018/wordml/cex" xmlns:w16cid="http://schemas.microsoft.com/office/word/2016/wordml/cid" xmlns:w16="http://schemas.microsoft.com/office/word/2018/wordml" xmlns:w16du="http://schemas.microsoft.com/office/word/2023/wordml/word16du" xmlns:w16sdtdh="http://schemas.microsoft.com/office/word/2020/wordml/sdtdatahash" xmlns:w16sdtfl="http://schemas.microsoft.com/office/word/2024/wordml/sdtformatlock" xmlns:w16se="http://schemas.microsoft.com/office/word/2015/wordml/symex" xmlns:wpg="http://schemas.microsoft.com/office/word/2010/wordprocessingGroup" xmlns:wpi="http://schemas.microsoft.com/office/word/2010/wordprocessingInk" xmlns:wne="http://schemas.microsoft.com/office/word/2006/wordml" xmlns:wps="http://schemas.microsoft.com/office/word/2010/wordprocessingShape" mc:Ignorable="w14 w15 w16se w16cid w16 w16cex w16sdtdh w16sdtfl w16du wp14">
   <w:body>
     <w:p>
-      <w:r>
-        <w:t xml:space="preserve"> Exhibit 12: Hybrid Identity Anomaly Detection – LANL Authentication Logs</w:t>
+      <w:pPr>
+        <w:pStyle w:val="Title"/>
+        <w:jc w:val="center"/>
+      </w:pPr>
+      <w:r>
+        <w:t>Exhibit 12: Hybrid Identity Anomaly Detection – LANL Authentication Logs</w:t>
       </w:r>
     </w:p>
     <w:p/>
     <w:p>
-      <w:r>
-        <w:t xml:space="preserve">Petitioner: Samuel Gbli Tetteh  </w:t>
-      </w:r>
-    </w:p>
-    <w:p>
-      <w:r>
-        <w:t>NIW Proposed Endeavor Pathway 1: Context</w:t>
-      </w:r>
-      <w:r>
-        <w:rPr>
-          <w:rFonts w:ascii="Cambria Math" w:hAnsi="Cambria Math" w:cs="Cambria Math"/>
-        </w:rPr>
-        <w:t>‑</w:t>
-      </w:r>
-      <w:r>
-        <w:t>aware anomaly detection models for hybrid identity systems</w:t>
+      <w:pPr>
+        <w:pStyle w:val="Subtitle"/>
+        <w:jc w:val="center"/>
+      </w:pPr>
+      <w:r>
+        <w:t>Petitioner: Samuel Gbli Tetteh</w:t>
+      </w:r>
+    </w:p>
+    <w:p>
+      <w:pPr>
+        <w:pStyle w:val="Subtitle"/>
+        <w:jc w:val="center"/>
+      </w:pPr>
+      <w:r>
+        <w:t>NIW Proposed Endeavor — Pathway 1: Context-aware anomaly detection models for hybrid identity systems</w:t>
       </w:r>
     </w:p>
     <w:p/>
     <w:p/>
     <w:p>
-      <w:r>
-        <w:t xml:space="preserve"> 1. Project Summary</w:t>
+      <w:pPr>
+        <w:pStyle w:val="Heading1"/>
+      </w:pPr>
+      <w:r>
+        <w:t>1. Project Summary</w:t>
       </w:r>
     </w:p>
     <w:p/>
@@ -77,15 +83,13 @@
       </w:r>
     </w:p>
     <w:p/>
-    <w:p>
-      <w:r>
-        <w:t>---</w:t>
-      </w:r>
-    </w:p>
     <w:p/>
     <w:p>
-      <w:r>
-        <w:t xml:space="preserve"> 2. Alignment with Proposed Endeavor</w:t>
+      <w:pPr>
+        <w:pStyle w:val="Heading1"/>
+      </w:pPr>
+      <w:r>
+        <w:t>2. Alignment with Proposed Endeavor</w:t>
       </w:r>
     </w:p>
     <w:p/>
@@ -105,8 +109,11 @@
     </w:p>
     <w:p/>
     <w:p>
-      <w:r>
-        <w:t>- It ingests real</w:t>
+      <w:pPr>
+        <w:pStyle w:val="ListBullet"/>
+      </w:pPr>
+      <w:r>
+        <w:t>It ingests real</w:t>
       </w:r>
       <w:r>
         <w:rPr>
@@ -119,23 +126,33 @@
       </w:r>
     </w:p>
     <w:p>
-      <w:r>
-        <w:t>- It engineers context features: time of day, day of week, weekend flag, user activity frequency, and PC diversity.</w:t>
-      </w:r>
-    </w:p>
-    <w:p>
-      <w:r>
-        <w:t>- It deploys an unsupervised Isolation Forest to detect deviations from normal behavior without labeled attack data.</w:t>
-      </w:r>
-    </w:p>
-    <w:p>
-      <w:r>
-        <w:t>- It identifies outliers that could represent credential theft, lateral movement, or misconfigurations.</w:t>
+      <w:pPr>
+        <w:pStyle w:val="ListBullet"/>
+      </w:pPr>
+      <w:r>
+        <w:t>It engineers context features: time of day, day of week, weekend flag, user activity frequency, and PC diversity.</w:t>
+      </w:r>
+    </w:p>
+    <w:p>
+      <w:pPr>
+        <w:pStyle w:val="ListBullet"/>
+      </w:pPr>
+      <w:r>
+        <w:t>It deploys an unsupervised Isolation Forest to detect deviations from normal behavior without labeled attack data.</w:t>
+      </w:r>
+    </w:p>
+    <w:p>
+      <w:pPr>
+        <w:pStyle w:val="ListBullet"/>
+      </w:pPr>
+      <w:r>
+        <w:t>It identifies outliers that could represent credential theft, lateral movement, or misconfigurations.</w:t>
       </w:r>
     </w:p>
     <w:p/>
     <w:p>
       <w:r>
+        <w:lastRenderedPageBreak/>
         <w:t>The project proves my ability to build ML</w:t>
       </w:r>
       <w:r>
@@ -149,27 +166,30 @@
       </w:r>
     </w:p>
     <w:p/>
-    <w:p>
-      <w:r>
-        <w:lastRenderedPageBreak/>
-        <w:t>---</w:t>
-      </w:r>
-    </w:p>
     <w:p/>
     <w:p>
-      <w:r>
-        <w:t xml:space="preserve"> 3. Technical Implementation</w:t>
+      <w:pPr>
+        <w:pStyle w:val="Heading1"/>
+      </w:pPr>
+      <w:r>
+        <w:t>3. Technical Implementation</w:t>
       </w:r>
     </w:p>
     <w:p/>
     <w:p>
-      <w:r>
-        <w:t xml:space="preserve"> 3.1 Dataset</w:t>
-      </w:r>
-    </w:p>
-    <w:p>
-      <w:r>
-        <w:t>- Source: LANL Comprehensive, Multi</w:t>
+      <w:pPr>
+        <w:pStyle w:val="Heading2"/>
+      </w:pPr>
+      <w:r>
+        <w:t>3.1 Dataset</w:t>
+      </w:r>
+    </w:p>
+    <w:p>
+      <w:pPr>
+        <w:pStyle w:val="ListBullet"/>
+      </w:pPr>
+      <w:r>
+        <w:t>Source: LANL Comprehensive, Multi</w:t>
       </w:r>
       <w:r>
         <w:rPr>
@@ -182,22 +202,19 @@
       </w:r>
     </w:p>
     <w:p>
-      <w:r>
-        <w:t xml:space="preserve">- </w:t>
-      </w:r>
-      <w:r>
-        <w:t>Size:</w:t>
-      </w:r>
-      <w:r>
-        <w:t xml:space="preserve"> </w:t>
-      </w:r>
-      <w:r>
-        <w:t>2,000,000 authentication events, 7,399 unique users, 4,157 unique source PCs.</w:t>
-      </w:r>
-    </w:p>
-    <w:p>
-      <w:r>
-        <w:t>- Processing: Data was processed using Polars (a high</w:t>
+      <w:pPr>
+        <w:pStyle w:val="ListBullet"/>
+      </w:pPr>
+      <w:r>
+        <w:t>Size: 2,000,000 authentication events, 7,399 unique users, 4,157 unique source PCs.</w:t>
+      </w:r>
+    </w:p>
+    <w:p>
+      <w:pPr>
+        <w:pStyle w:val="ListBullet"/>
+      </w:pPr>
+      <w:r>
+        <w:t>Processing: Data was processed using Polars (a high</w:t>
       </w:r>
       <w:r>
         <w:rPr>
@@ -218,30 +235,45 @@
       </w:r>
     </w:p>
     <w:p>
-      <w:r>
-        <w:t>- Features engineered: Hour, day of week, weekend indicator, hourly login count per user, unique PC count per user, logon type encoding.</w:t>
+      <w:pPr>
+        <w:pStyle w:val="ListBullet"/>
+      </w:pPr>
+      <w:r>
+        <w:t>Features engineered: Hour, day of week, weekend indicator, hourly login count per user, unique PC count per user, logon type encoding.</w:t>
       </w:r>
     </w:p>
     <w:p/>
     <w:p>
-      <w:r>
-        <w:t xml:space="preserve"> 3.2 Model</w:t>
-      </w:r>
-    </w:p>
-    <w:p>
-      <w:r>
-        <w:t>- Algorithm: Isolation Forest (contamination=0.01, 100 estimators).</w:t>
-      </w:r>
-    </w:p>
-    <w:p>
-      <w:r>
-        <w:t>- Approach: Features were standardized; the model was trained unsupervised to assign anomaly scores.</w:t>
+      <w:pPr>
+        <w:pStyle w:val="Heading2"/>
+      </w:pPr>
+      <w:r>
+        <w:t>3.2 Model</w:t>
+      </w:r>
+    </w:p>
+    <w:p>
+      <w:pPr>
+        <w:pStyle w:val="ListBullet"/>
+      </w:pPr>
+      <w:r>
+        <w:t>Algorithm: Isolation Forest (contamination=0.01, 100 estimators).</w:t>
+      </w:r>
+    </w:p>
+    <w:p>
+      <w:pPr>
+        <w:pStyle w:val="ListBullet"/>
+      </w:pPr>
+      <w:r>
+        <w:t>Approach: Features were standardized; the model was trained unsupervised to assign anomaly scores.</w:t>
       </w:r>
     </w:p>
     <w:p/>
     <w:p>
-      <w:r>
-        <w:t xml:space="preserve"> 3.3 Key Results</w:t>
+      <w:pPr>
+        <w:pStyle w:val="Heading2"/>
+      </w:pPr>
+      <w:r>
+        <w:t>3.3 Key Results</w:t>
       </w:r>
     </w:p>
     <w:p>
@@ -473,14 +505,21 @@
       </w:pPr>
     </w:p>
     <w:p>
-      <w:r>
-        <w:t>Figure: Summary output from the completed notebook.</w:t>
+      <w:pPr>
+        <w:pStyle w:val="Caption"/>
+        <w:jc w:val="center"/>
+      </w:pPr>
+      <w:r>
+        <w:t>Figure 1. Summary output from the completed notebook.</w:t>
       </w:r>
     </w:p>
     <w:p/>
     <w:p>
-      <w:r>
-        <w:t xml:space="preserve"> 3.4 Reproducibility</w:t>
+      <w:pPr>
+        <w:pStyle w:val="Heading2"/>
+      </w:pPr>
+      <w:r>
+        <w:t>3.4 Reproducibility</w:t>
       </w:r>
     </w:p>
     <w:p>
@@ -489,52 +528,52 @@
       </w:r>
     </w:p>
     <w:p>
-      <w:hyperlink r:id="rId4" w:history="1">
-        <w:r>
-          <w:rPr>
-            <w:rStyle w:val="Hyperlink"/>
-          </w:rPr>
-          <w:t>[Insert your GitHub repo URL here]</w:t>
-        </w:r>
-      </w:hyperlink>
-      <w:r>
-        <w:t xml:space="preserve"> - </w:t>
-      </w:r>
-      <w:r>
-        <w:t>https://github.com/samuelgtetteh/Samuel_Tetteh_Dev-V2_Restart</w:t>
+      <w:r>
+        <w:lastRenderedPageBreak/>
+        <w:t>https://github.com/samuelgtetteh/ai-cybersecurity-portfolio</w:t>
       </w:r>
     </w:p>
     <w:p/>
     <w:p>
-      <w:r>
-        <w:lastRenderedPageBreak/>
-        <w:t xml:space="preserve"> 4. Visual Evidence</w:t>
+      <w:pPr>
+        <w:pStyle w:val="Heading1"/>
+      </w:pPr>
+      <w:r>
+        <w:t>4. Visual Evidence</w:t>
       </w:r>
     </w:p>
     <w:p/>
     <w:p>
-      <w:r>
-        <w:t xml:space="preserve"> 4.1 Notebook Summary Output</w:t>
-      </w:r>
-    </w:p>
-    <w:p>
-      <w:r>
-        <w:t xml:space="preserve">![Summary metrics](Exhibit12a_summary.png)  </w:t>
-      </w:r>
-    </w:p>
-    <w:p>
-      <w:r>
-        <w:t>Caption: Output of the summary cell showing dataset size, anomaly count, and top anomalous user.</w:t>
+      <w:pPr>
+        <w:pStyle w:val="Heading2"/>
+      </w:pPr>
+      <w:r>
+        <w:t>4.1 Notebook Summary Output</w:t>
+      </w:r>
+    </w:p>
+    <w:p>
+      <w:pPr>
+        <w:pStyle w:val="Caption"/>
+        <w:jc w:val="center"/>
+      </w:pPr>
+      <w:r>
+        <w:t>Figure 2. Summary cell output — dataset size, anomaly count, and top anomalous user.</w:t>
       </w:r>
     </w:p>
     <w:p/>
     <w:p>
-      <w:r>
-        <w:t xml:space="preserve"> 4.2 Anomaly Visualization (if available)</w:t>
-      </w:r>
-    </w:p>
-    <w:p>
-      <w:r>
+      <w:pPr>
+        <w:pStyle w:val="Heading2"/>
+      </w:pPr>
+      <w:r>
+        <w:t>4.2 Anomaly Visualization (if available)</w:t>
+      </w:r>
+    </w:p>
+    <w:p>
+      <w:r>
+        <w:rPr>
+          <w:noProof/>
+        </w:rPr>
         <w:drawing>
           <wp:inline distT="0" distB="0" distL="0" distR="0" wp14:anchorId="3A4BFE13" wp14:editId="7B236B53">
             <wp:extent cx="4425968" cy="3483558"/>
@@ -551,7 +590,7 @@
                     <pic:cNvPicPr/>
                   </pic:nvPicPr>
                   <pic:blipFill>
-                    <a:blip r:embed="rId5"/>
+                    <a:blip r:embed="rId7"/>
                     <a:stretch>
                       <a:fillRect/>
                     </a:stretch>
@@ -574,6 +613,9 @@
     </w:p>
     <w:p>
       <w:r>
+        <w:rPr>
+          <w:noProof/>
+        </w:rPr>
         <w:lastRenderedPageBreak/>
         <w:drawing>
           <wp:inline distT="0" distB="0" distL="0" distR="0" wp14:anchorId="7B349266" wp14:editId="7ECAEED2">
@@ -591,7 +633,7 @@
                     <pic:cNvPicPr/>
                   </pic:nvPicPr>
                   <pic:blipFill>
-                    <a:blip r:embed="rId6"/>
+                    <a:blip r:embed="rId8"/>
                     <a:stretch>
                       <a:fillRect/>
                     </a:stretch>
@@ -612,6 +654,9 @@
         </w:drawing>
       </w:r>
       <w:r>
+        <w:rPr>
+          <w:noProof/>
+        </w:rPr>
         <w:drawing>
           <wp:inline distT="0" distB="0" distL="0" distR="0" wp14:anchorId="671DF26F" wp14:editId="37661A0B">
             <wp:extent cx="5943600" cy="3115945"/>
@@ -628,7 +673,7 @@
                     <pic:cNvPicPr/>
                   </pic:nvPicPr>
                   <pic:blipFill>
-                    <a:blip r:embed="rId7"/>
+                    <a:blip r:embed="rId9"/>
                     <a:stretch>
                       <a:fillRect/>
                     </a:stretch>
@@ -649,6 +694,9 @@
         </w:drawing>
       </w:r>
       <w:r>
+        <w:rPr>
+          <w:noProof/>
+        </w:rPr>
         <w:lastRenderedPageBreak/>
         <w:drawing>
           <wp:inline distT="0" distB="0" distL="0" distR="0" wp14:anchorId="70FB2904" wp14:editId="5A444C80">
@@ -666,7 +714,7 @@
                     <pic:cNvPicPr/>
                   </pic:nvPicPr>
                   <pic:blipFill>
-                    <a:blip r:embed="rId8"/>
+                    <a:blip r:embed="rId10"/>
                     <a:stretch>
                       <a:fillRect/>
                     </a:stretch>
@@ -688,20 +736,22 @@
       </w:r>
     </w:p>
     <w:p>
-      <w:r>
-        <w:t xml:space="preserve">![Anomaly distribution](Exhibit12b_plot.png)  </w:t>
-      </w:r>
-    </w:p>
-    <w:p>
-      <w:r>
-        <w:t>Caption: Plot of anomaly distribution, demonstrating the model’s detection capability.</w:t>
+      <w:pPr>
+        <w:pStyle w:val="Caption"/>
+        <w:jc w:val="center"/>
+      </w:pPr>
+      <w:r>
+        <w:t>Figure 3. Anomaly distribution, demonstrating the model’s detection capability.</w:t>
       </w:r>
     </w:p>
     <w:p/>
     <w:p/>
     <w:p>
-      <w:r>
-        <w:t xml:space="preserve"> 5. Significance for the “Well Positioned” Prong</w:t>
+      <w:pPr>
+        <w:pStyle w:val="Heading1"/>
+      </w:pPr>
+      <w:r>
+        <w:t>5. Significance for the “Well Positioned” Prong</w:t>
       </w:r>
     </w:p>
     <w:p/>
@@ -712,8 +762,11 @@
     </w:p>
     <w:p/>
     <w:p>
-      <w:r>
-        <w:t>- Built a context</w:t>
+      <w:pPr>
+        <w:pStyle w:val="ListBullet"/>
+      </w:pPr>
+      <w:r>
+        <w:t>Built a context</w:t>
       </w:r>
       <w:r>
         <w:rPr>
@@ -726,18 +779,27 @@
       </w:r>
     </w:p>
     <w:p>
-      <w:r>
-        <w:t>- Trained and evaluated an unsupervised anomaly detector on 500,000 real authentication events.</w:t>
-      </w:r>
-    </w:p>
-    <w:p>
-      <w:r>
-        <w:t>- Produced a reusable model that can be deployed in a SIEM or identity analytics tool.</w:t>
-      </w:r>
-    </w:p>
-    <w:p>
-      <w:r>
-        <w:t>- Published the code and artifacts openly to benefit the broader security community.</w:t>
+      <w:pPr>
+        <w:pStyle w:val="ListBullet"/>
+      </w:pPr>
+      <w:r>
+        <w:t>Trained and evaluated an unsupervised anomaly detector on 500,000 real authentication events.</w:t>
+      </w:r>
+    </w:p>
+    <w:p>
+      <w:pPr>
+        <w:pStyle w:val="ListBullet"/>
+      </w:pPr>
+      <w:r>
+        <w:t>Produced a reusable model that can be deployed in a SIEM or identity analytics tool.</w:t>
+      </w:r>
+    </w:p>
+    <w:p>
+      <w:pPr>
+        <w:pStyle w:val="ListBullet"/>
+      </w:pPr>
+      <w:r>
+        <w:t>Published the code and artifacts openly to benefit the broader security community.</w:t>
       </w:r>
     </w:p>
     <w:p/>
@@ -766,6 +828,12 @@
       </w:r>
     </w:p>
     <w:sectPr>
+      <w:headerReference w:type="even" r:id="rId11"/>
+      <w:headerReference w:type="default" r:id="rId12"/>
+      <w:footerReference w:type="even" r:id="rId13"/>
+      <w:footerReference w:type="default" r:id="rId14"/>
+      <w:headerReference w:type="first" r:id="rId15"/>
+      <w:footerReference w:type="first" r:id="rId16"/>
       <w:pgSz w:w="12240" w:h="15840"/>
       <w:pgMar w:top="1440" w:right="1440" w:bottom="1440" w:left="1440" w:header="720" w:footer="720" w:gutter="0"/>
       <w:cols w:space="720"/>
@@ -773,6 +841,145 @@
     </w:sectPr>
   </w:body>
 </w:document>
+</file>
+
+<file path=word/endnotes.xml><?xml version="1.0" encoding="utf-8"?>
+<w:endnotes xmlns:wpc="http://schemas.microsoft.com/office/word/2010/wordprocessingCanvas" xmlns:cx="http://schemas.microsoft.com/office/drawing/2014/chartex" xmlns:cx1="http://schemas.microsoft.com/office/drawing/2015/9/8/chartex" xmlns:cx2="http://schemas.microsoft.com/office/drawing/2015/10/21/chartex" xmlns:cx3="http://schemas.microsoft.com/office/drawing/2016/5/9/chartex" xmlns:cx4="http://schemas.microsoft.com/office/drawing/2016/5/10/chartex" xmlns:cx5="http://schemas.microsoft.com/office/drawing/2016/5/11/chartex" xmlns:cx6="http://schemas.microsoft.com/office/drawing/2016/5/12/chartex" xmlns:cx7="http://schemas.microsoft.com/office/drawing/2016/5/13/chartex" xmlns:cx8="http://schemas.microsoft.com/office/drawing/2016/5/14/chartex" xmlns:mc="http://schemas.openxmlformats.org/markup-compatibility/2006" xmlns:aink="http://schemas.microsoft.com/office/drawing/2016/ink" xmlns:am3d="http://schemas.microsoft.com/office/drawing/2017/model3d" xmlns:o="urn:schemas-microsoft-com:office:office" xmlns:oel="http://schemas.microsoft.com/office/2019/extlst" xmlns:r="http://schemas.openxmlformats.org/officeDocument/2006/relationships" xmlns:m="http://schemas.openxmlformats.org/officeDocument/2006/math" xmlns:v="urn:schemas-microsoft-com:vml" xmlns:wp14="http://schemas.microsoft.com/office/word/2010/wordprocessingDrawing" xmlns:wp="http://schemas.openxmlformats.org/drawingml/2006/wordprocessingDrawing" xmlns:w10="urn:schemas-microsoft-com:office:word" xmlns:w="http://schemas.openxmlformats.org/wordprocessingml/2006/main" xmlns:w14="http://schemas.microsoft.com/office/word/2010/wordml" xmlns:w15="http://schemas.microsoft.com/office/word/2012/wordml" xmlns:w16cex="http://schemas.microsoft.com/office/word/2018/wordml/cex" xmlns:w16cid="http://schemas.microsoft.com/office/word/2016/wordml/cid" xmlns:w16="http://schemas.microsoft.com/office/word/2018/wordml" xmlns:w16du="http://schemas.microsoft.com/office/word/2023/wordml/word16du" xmlns:w16sdtdh="http://schemas.microsoft.com/office/word/2020/wordml/sdtdatahash" xmlns:w16sdtfl="http://schemas.microsoft.com/office/word/2024/wordml/sdtformatlock" xmlns:w16se="http://schemas.microsoft.com/office/word/2015/wordml/symex" xmlns:wpg="http://schemas.microsoft.com/office/word/2010/wordprocessingGroup" xmlns:wpi="http://schemas.microsoft.com/office/word/2010/wordprocessingInk" xmlns:wne="http://schemas.microsoft.com/office/word/2006/wordml" xmlns:wps="http://schemas.microsoft.com/office/word/2010/wordprocessingShape" mc:Ignorable="w14 w15 w16se w16cid w16 w16cex w16sdtdh w16sdtfl w16du wp14">
+  <w:endnote w:type="separator" w:id="-1">
+    <w:p>
+      <w:pPr>
+        <w:spacing w:after="0" w:line="240" w:lineRule="auto"/>
+      </w:pPr>
+      <w:r>
+        <w:separator/>
+      </w:r>
+    </w:p>
+  </w:endnote>
+  <w:endnote w:type="continuationSeparator" w:id="0">
+    <w:p>
+      <w:pPr>
+        <w:spacing w:after="0" w:line="240" w:lineRule="auto"/>
+      </w:pPr>
+      <w:r>
+        <w:continuationSeparator/>
+      </w:r>
+    </w:p>
+  </w:endnote>
+</w:endnotes>
+</file>
+
+<file path=word/footer1.xml><?xml version="1.0" encoding="utf-8"?>
+<w:ftr xmlns:wpc="http://schemas.microsoft.com/office/word/2010/wordprocessingCanvas" xmlns:cx="http://schemas.microsoft.com/office/drawing/2014/chartex" xmlns:cx1="http://schemas.microsoft.com/office/drawing/2015/9/8/chartex" xmlns:cx2="http://schemas.microsoft.com/office/drawing/2015/10/21/chartex" xmlns:cx3="http://schemas.microsoft.com/office/drawing/2016/5/9/chartex" xmlns:cx4="http://schemas.microsoft.com/office/drawing/2016/5/10/chartex" xmlns:cx5="http://schemas.microsoft.com/office/drawing/2016/5/11/chartex" xmlns:cx6="http://schemas.microsoft.com/office/drawing/2016/5/12/chartex" xmlns:cx7="http://schemas.microsoft.com/office/drawing/2016/5/13/chartex" xmlns:cx8="http://schemas.microsoft.com/office/drawing/2016/5/14/chartex" xmlns:mc="http://schemas.openxmlformats.org/markup-compatibility/2006" xmlns:aink="http://schemas.microsoft.com/office/drawing/2016/ink" xmlns:am3d="http://schemas.microsoft.com/office/drawing/2017/model3d" xmlns:o="urn:schemas-microsoft-com:office:office" xmlns:oel="http://schemas.microsoft.com/office/2019/extlst" xmlns:r="http://schemas.openxmlformats.org/officeDocument/2006/relationships" xmlns:m="http://schemas.openxmlformats.org/officeDocument/2006/math" xmlns:v="urn:schemas-microsoft-com:vml" xmlns:wp14="http://schemas.microsoft.com/office/word/2010/wordprocessingDrawing" xmlns:wp="http://schemas.openxmlformats.org/drawingml/2006/wordprocessingDrawing" xmlns:w10="urn:schemas-microsoft-com:office:word" xmlns:w="http://schemas.openxmlformats.org/wordprocessingml/2006/main" xmlns:w14="http://schemas.microsoft.com/office/word/2010/wordml" xmlns:w15="http://schemas.microsoft.com/office/word/2012/wordml" xmlns:w16cex="http://schemas.microsoft.com/office/word/2018/wordml/cex" xmlns:w16cid="http://schemas.microsoft.com/office/word/2016/wordml/cid" xmlns:w16="http://schemas.microsoft.com/office/word/2018/wordml" xmlns:w16du="http://schemas.microsoft.com/office/word/2023/wordml/word16du" xmlns:w16sdtdh="http://schemas.microsoft.com/office/word/2020/wordml/sdtdatahash" xmlns:w16sdtfl="http://schemas.microsoft.com/office/word/2024/wordml/sdtformatlock" xmlns:w16se="http://schemas.microsoft.com/office/word/2015/wordml/symex" xmlns:wpg="http://schemas.microsoft.com/office/word/2010/wordprocessingGroup" xmlns:wpi="http://schemas.microsoft.com/office/word/2010/wordprocessingInk" xmlns:wne="http://schemas.microsoft.com/office/word/2006/wordml" xmlns:wps="http://schemas.microsoft.com/office/word/2010/wordprocessingShape" mc:Ignorable="w14 w15 w16se w16cid w16 w16cex w16sdtdh w16sdtfl w16du wp14">
+  <w:p>
+    <w:pPr>
+      <w:pStyle w:val="Footer"/>
+    </w:pPr>
+  </w:p>
+</w:ftr>
+</file>
+
+<file path=word/footer2.xml><?xml version="1.0" encoding="utf-8"?>
+<w:ftr xmlns:wpc="http://schemas.microsoft.com/office/word/2010/wordprocessingCanvas" xmlns:cx="http://schemas.microsoft.com/office/drawing/2014/chartex" xmlns:cx1="http://schemas.microsoft.com/office/drawing/2015/9/8/chartex" xmlns:cx2="http://schemas.microsoft.com/office/drawing/2015/10/21/chartex" xmlns:cx3="http://schemas.microsoft.com/office/drawing/2016/5/9/chartex" xmlns:cx4="http://schemas.microsoft.com/office/drawing/2016/5/10/chartex" xmlns:cx5="http://schemas.microsoft.com/office/drawing/2016/5/11/chartex" xmlns:cx6="http://schemas.microsoft.com/office/drawing/2016/5/12/chartex" xmlns:cx7="http://schemas.microsoft.com/office/drawing/2016/5/13/chartex" xmlns:cx8="http://schemas.microsoft.com/office/drawing/2016/5/14/chartex" xmlns:mc="http://schemas.openxmlformats.org/markup-compatibility/2006" xmlns:aink="http://schemas.microsoft.com/office/drawing/2016/ink" xmlns:am3d="http://schemas.microsoft.com/office/drawing/2017/model3d" xmlns:o="urn:schemas-microsoft-com:office:office" xmlns:oel="http://schemas.microsoft.com/office/2019/extlst" xmlns:r="http://schemas.openxmlformats.org/officeDocument/2006/relationships" xmlns:m="http://schemas.openxmlformats.org/officeDocument/2006/math" xmlns:v="urn:schemas-microsoft-com:vml" xmlns:wp14="http://schemas.microsoft.com/office/word/2010/wordprocessingDrawing" xmlns:wp="http://schemas.openxmlformats.org/drawingml/2006/wordprocessingDrawing" xmlns:w10="urn:schemas-microsoft-com:office:word" xmlns:w="http://schemas.openxmlformats.org/wordprocessingml/2006/main" xmlns:w14="http://schemas.microsoft.com/office/word/2010/wordml" xmlns:w15="http://schemas.microsoft.com/office/word/2012/wordml" xmlns:w16cex="http://schemas.microsoft.com/office/word/2018/wordml/cex" xmlns:w16cid="http://schemas.microsoft.com/office/word/2016/wordml/cid" xmlns:w16="http://schemas.microsoft.com/office/word/2018/wordml" xmlns:w16du="http://schemas.microsoft.com/office/word/2023/wordml/word16du" xmlns:w16sdtdh="http://schemas.microsoft.com/office/word/2020/wordml/sdtdatahash" xmlns:w16sdtfl="http://schemas.microsoft.com/office/word/2024/wordml/sdtformatlock" xmlns:w16se="http://schemas.microsoft.com/office/word/2015/wordml/symex" xmlns:wpg="http://schemas.microsoft.com/office/word/2010/wordprocessingGroup" xmlns:wpi="http://schemas.microsoft.com/office/word/2010/wordprocessingInk" xmlns:wne="http://schemas.microsoft.com/office/word/2006/wordml" xmlns:wps="http://schemas.microsoft.com/office/word/2010/wordprocessingShape" mc:Ignorable="w14 w15 w16se w16cid w16 w16cex w16sdtdh w16sdtfl w16du wp14">
+  <w:p>
+    <w:pPr>
+      <w:pStyle w:val="Footer"/>
+    </w:pPr>
+  </w:p>
+</w:ftr>
+</file>
+
+<file path=word/footer3.xml><?xml version="1.0" encoding="utf-8"?>
+<w:ftr xmlns:wpc="http://schemas.microsoft.com/office/word/2010/wordprocessingCanvas" xmlns:cx="http://schemas.microsoft.com/office/drawing/2014/chartex" xmlns:cx1="http://schemas.microsoft.com/office/drawing/2015/9/8/chartex" xmlns:cx2="http://schemas.microsoft.com/office/drawing/2015/10/21/chartex" xmlns:cx3="http://schemas.microsoft.com/office/drawing/2016/5/9/chartex" xmlns:cx4="http://schemas.microsoft.com/office/drawing/2016/5/10/chartex" xmlns:cx5="http://schemas.microsoft.com/office/drawing/2016/5/11/chartex" xmlns:cx6="http://schemas.microsoft.com/office/drawing/2016/5/12/chartex" xmlns:cx7="http://schemas.microsoft.com/office/drawing/2016/5/13/chartex" xmlns:cx8="http://schemas.microsoft.com/office/drawing/2016/5/14/chartex" xmlns:mc="http://schemas.openxmlformats.org/markup-compatibility/2006" xmlns:aink="http://schemas.microsoft.com/office/drawing/2016/ink" xmlns:am3d="http://schemas.microsoft.com/office/drawing/2017/model3d" xmlns:o="urn:schemas-microsoft-com:office:office" xmlns:oel="http://schemas.microsoft.com/office/2019/extlst" xmlns:r="http://schemas.openxmlformats.org/officeDocument/2006/relationships" xmlns:m="http://schemas.openxmlformats.org/officeDocument/2006/math" xmlns:v="urn:schemas-microsoft-com:vml" xmlns:wp14="http://schemas.microsoft.com/office/word/2010/wordprocessingDrawing" xmlns:wp="http://schemas.openxmlformats.org/drawingml/2006/wordprocessingDrawing" xmlns:w10="urn:schemas-microsoft-com:office:word" xmlns:w="http://schemas.openxmlformats.org/wordprocessingml/2006/main" xmlns:w14="http://schemas.microsoft.com/office/word/2010/wordml" xmlns:w15="http://schemas.microsoft.com/office/word/2012/wordml" xmlns:w16cex="http://schemas.microsoft.com/office/word/2018/wordml/cex" xmlns:w16cid="http://schemas.microsoft.com/office/word/2016/wordml/cid" xmlns:w16="http://schemas.microsoft.com/office/word/2018/wordml" xmlns:w16du="http://schemas.microsoft.com/office/word/2023/wordml/word16du" xmlns:w16sdtdh="http://schemas.microsoft.com/office/word/2020/wordml/sdtdatahash" xmlns:w16sdtfl="http://schemas.microsoft.com/office/word/2024/wordml/sdtformatlock" xmlns:w16se="http://schemas.microsoft.com/office/word/2015/wordml/symex" xmlns:wpg="http://schemas.microsoft.com/office/word/2010/wordprocessingGroup" xmlns:wpi="http://schemas.microsoft.com/office/word/2010/wordprocessingInk" xmlns:wne="http://schemas.microsoft.com/office/word/2006/wordml" xmlns:wps="http://schemas.microsoft.com/office/word/2010/wordprocessingShape" mc:Ignorable="w14 w15 w16se w16cid w16 w16cex w16sdtdh w16sdtfl w16du wp14">
+  <w:p>
+    <w:pPr>
+      <w:pStyle w:val="Footer"/>
+    </w:pPr>
+  </w:p>
+</w:ftr>
+</file>
+
+<file path=word/footnotes.xml><?xml version="1.0" encoding="utf-8"?>
+<w:footnotes xmlns:wpc="http://schemas.microsoft.com/office/word/2010/wordprocessingCanvas" xmlns:cx="http://schemas.microsoft.com/office/drawing/2014/chartex" xmlns:cx1="http://schemas.microsoft.com/office/drawing/2015/9/8/chartex" xmlns:cx2="http://schemas.microsoft.com/office/drawing/2015/10/21/chartex" xmlns:cx3="http://schemas.microsoft.com/office/drawing/2016/5/9/chartex" xmlns:cx4="http://schemas.microsoft.com/office/drawing/2016/5/10/chartex" xmlns:cx5="http://schemas.microsoft.com/office/drawing/2016/5/11/chartex" xmlns:cx6="http://schemas.microsoft.com/office/drawing/2016/5/12/chartex" xmlns:cx7="http://schemas.microsoft.com/office/drawing/2016/5/13/chartex" xmlns:cx8="http://schemas.microsoft.com/office/drawing/2016/5/14/chartex" xmlns:mc="http://schemas.openxmlformats.org/markup-compatibility/2006" xmlns:aink="http://schemas.microsoft.com/office/drawing/2016/ink" xmlns:am3d="http://schemas.microsoft.com/office/drawing/2017/model3d" xmlns:o="urn:schemas-microsoft-com:office:office" xmlns:oel="http://schemas.microsoft.com/office/2019/extlst" xmlns:r="http://schemas.openxmlformats.org/officeDocument/2006/relationships" xmlns:m="http://schemas.openxmlformats.org/officeDocument/2006/math" xmlns:v="urn:schemas-microsoft-com:vml" xmlns:wp14="http://schemas.microsoft.com/office/word/2010/wordprocessingDrawing" xmlns:wp="http://schemas.openxmlformats.org/drawingml/2006/wordprocessingDrawing" xmlns:w10="urn:schemas-microsoft-com:office:word" xmlns:w="http://schemas.openxmlformats.org/wordprocessingml/2006/main" xmlns:w14="http://schemas.microsoft.com/office/word/2010/wordml" xmlns:w15="http://schemas.microsoft.com/office/word/2012/wordml" xmlns:w16cex="http://schemas.microsoft.com/office/word/2018/wordml/cex" xmlns:w16cid="http://schemas.microsoft.com/office/word/2016/wordml/cid" xmlns:w16="http://schemas.microsoft.com/office/word/2018/wordml" xmlns:w16du="http://schemas.microsoft.com/office/word/2023/wordml/word16du" xmlns:w16sdtdh="http://schemas.microsoft.com/office/word/2020/wordml/sdtdatahash" xmlns:w16sdtfl="http://schemas.microsoft.com/office/word/2024/wordml/sdtformatlock" xmlns:w16se="http://schemas.microsoft.com/office/word/2015/wordml/symex" xmlns:wpg="http://schemas.microsoft.com/office/word/2010/wordprocessingGroup" xmlns:wpi="http://schemas.microsoft.com/office/word/2010/wordprocessingInk" xmlns:wne="http://schemas.microsoft.com/office/word/2006/wordml" xmlns:wps="http://schemas.microsoft.com/office/word/2010/wordprocessingShape" mc:Ignorable="w14 w15 w16se w16cid w16 w16cex w16sdtdh w16sdtfl w16du wp14">
+  <w:footnote w:type="separator" w:id="-1">
+    <w:p>
+      <w:pPr>
+        <w:spacing w:after="0" w:line="240" w:lineRule="auto"/>
+      </w:pPr>
+      <w:r>
+        <w:separator/>
+      </w:r>
+    </w:p>
+  </w:footnote>
+  <w:footnote w:type="continuationSeparator" w:id="0">
+    <w:p>
+      <w:pPr>
+        <w:spacing w:after="0" w:line="240" w:lineRule="auto"/>
+      </w:pPr>
+      <w:r>
+        <w:continuationSeparator/>
+      </w:r>
+    </w:p>
+  </w:footnote>
+</w:footnotes>
+</file>
+
+<file path=word/header1.xml><?xml version="1.0" encoding="utf-8"?>
+<w:hdr xmlns:wpc="http://schemas.microsoft.com/office/word/2010/wordprocessingCanvas" xmlns:cx="http://schemas.microsoft.com/office/drawing/2014/chartex" xmlns:cx1="http://schemas.microsoft.com/office/drawing/2015/9/8/chartex" xmlns:cx2="http://schemas.microsoft.com/office/drawing/2015/10/21/chartex" xmlns:cx3="http://schemas.microsoft.com/office/drawing/2016/5/9/chartex" xmlns:cx4="http://schemas.microsoft.com/office/drawing/2016/5/10/chartex" xmlns:cx5="http://schemas.microsoft.com/office/drawing/2016/5/11/chartex" xmlns:cx6="http://schemas.microsoft.com/office/drawing/2016/5/12/chartex" xmlns:cx7="http://schemas.microsoft.com/office/drawing/2016/5/13/chartex" xmlns:cx8="http://schemas.microsoft.com/office/drawing/2016/5/14/chartex" xmlns:mc="http://schemas.openxmlformats.org/markup-compatibility/2006" xmlns:aink="http://schemas.microsoft.com/office/drawing/2016/ink" xmlns:am3d="http://schemas.microsoft.com/office/drawing/2017/model3d" xmlns:o="urn:schemas-microsoft-com:office:office" xmlns:oel="http://schemas.microsoft.com/office/2019/extlst" xmlns:r="http://schemas.openxmlformats.org/officeDocument/2006/relationships" xmlns:m="http://schemas.openxmlformats.org/officeDocument/2006/math" xmlns:v="urn:schemas-microsoft-com:vml" xmlns:wp14="http://schemas.microsoft.com/office/word/2010/wordprocessingDrawing" xmlns:wp="http://schemas.openxmlformats.org/drawingml/2006/wordprocessingDrawing" xmlns:w10="urn:schemas-microsoft-com:office:word" xmlns:w="http://schemas.openxmlformats.org/wordprocessingml/2006/main" xmlns:w14="http://schemas.microsoft.com/office/word/2010/wordml" xmlns:w15="http://schemas.microsoft.com/office/word/2012/wordml" xmlns:w16cex="http://schemas.microsoft.com/office/word/2018/wordml/cex" xmlns:w16cid="http://schemas.microsoft.com/office/word/2016/wordml/cid" xmlns:w16="http://schemas.microsoft.com/office/word/2018/wordml" xmlns:w16du="http://schemas.microsoft.com/office/word/2023/wordml/word16du" xmlns:w16sdtdh="http://schemas.microsoft.com/office/word/2020/wordml/sdtdatahash" xmlns:w16sdtfl="http://schemas.microsoft.com/office/word/2024/wordml/sdtformatlock" xmlns:w16se="http://schemas.microsoft.com/office/word/2015/wordml/symex" xmlns:wpg="http://schemas.microsoft.com/office/word/2010/wordprocessingGroup" xmlns:wpi="http://schemas.microsoft.com/office/word/2010/wordprocessingInk" xmlns:wne="http://schemas.microsoft.com/office/word/2006/wordml" xmlns:wps="http://schemas.microsoft.com/office/word/2010/wordprocessingShape" mc:Ignorable="w14 w15 w16se w16cid w16 w16cex w16sdtdh w16sdtfl w16du wp14">
+  <w:p>
+    <w:pPr>
+      <w:pStyle w:val="Header"/>
+    </w:pPr>
+  </w:p>
+</w:hdr>
+</file>
+
+<file path=word/header2.xml><?xml version="1.0" encoding="utf-8"?>
+<w:hdr xmlns:wpc="http://schemas.microsoft.com/office/word/2010/wordprocessingCanvas" xmlns:cx="http://schemas.microsoft.com/office/drawing/2014/chartex" xmlns:cx1="http://schemas.microsoft.com/office/drawing/2015/9/8/chartex" xmlns:cx2="http://schemas.microsoft.com/office/drawing/2015/10/21/chartex" xmlns:cx3="http://schemas.microsoft.com/office/drawing/2016/5/9/chartex" xmlns:cx4="http://schemas.microsoft.com/office/drawing/2016/5/10/chartex" xmlns:cx5="http://schemas.microsoft.com/office/drawing/2016/5/11/chartex" xmlns:cx6="http://schemas.microsoft.com/office/drawing/2016/5/12/chartex" xmlns:cx7="http://schemas.microsoft.com/office/drawing/2016/5/13/chartex" xmlns:cx8="http://schemas.microsoft.com/office/drawing/2016/5/14/chartex" xmlns:mc="http://schemas.openxmlformats.org/markup-compatibility/2006" xmlns:aink="http://schemas.microsoft.com/office/drawing/2016/ink" xmlns:am3d="http://schemas.microsoft.com/office/drawing/2017/model3d" xmlns:o="urn:schemas-microsoft-com:office:office" xmlns:oel="http://schemas.microsoft.com/office/2019/extlst" xmlns:r="http://schemas.openxmlformats.org/officeDocument/2006/relationships" xmlns:m="http://schemas.openxmlformats.org/officeDocument/2006/math" xmlns:v="urn:schemas-microsoft-com:vml" xmlns:wp14="http://schemas.microsoft.com/office/word/2010/wordprocessingDrawing" xmlns:wp="http://schemas.openxmlformats.org/drawingml/2006/wordprocessingDrawing" xmlns:w10="urn:schemas-microsoft-com:office:word" xmlns:w="http://schemas.openxmlformats.org/wordprocessingml/2006/main" xmlns:w14="http://schemas.microsoft.com/office/word/2010/wordml" xmlns:w15="http://schemas.microsoft.com/office/word/2012/wordml" xmlns:w16cex="http://schemas.microsoft.com/office/word/2018/wordml/cex" xmlns:w16cid="http://schemas.microsoft.com/office/word/2016/wordml/cid" xmlns:w16="http://schemas.microsoft.com/office/word/2018/wordml" xmlns:w16du="http://schemas.microsoft.com/office/word/2023/wordml/word16du" xmlns:w16sdtdh="http://schemas.microsoft.com/office/word/2020/wordml/sdtdatahash" xmlns:w16sdtfl="http://schemas.microsoft.com/office/word/2024/wordml/sdtformatlock" xmlns:w16se="http://schemas.microsoft.com/office/word/2015/wordml/symex" xmlns:wpg="http://schemas.microsoft.com/office/word/2010/wordprocessingGroup" xmlns:wpi="http://schemas.microsoft.com/office/word/2010/wordprocessingInk" xmlns:wne="http://schemas.microsoft.com/office/word/2006/wordml" xmlns:wps="http://schemas.microsoft.com/office/word/2010/wordprocessingShape" mc:Ignorable="w14 w15 w16se w16cid w16 w16cex w16sdtdh w16sdtfl w16du wp14">
+  <w:p>
+    <w:pPr>
+      <w:pStyle w:val="Header"/>
+    </w:pPr>
+  </w:p>
+</w:hdr>
+</file>
+
+<file path=word/header3.xml><?xml version="1.0" encoding="utf-8"?>
+<w:hdr xmlns:wpc="http://schemas.microsoft.com/office/word/2010/wordprocessingCanvas" xmlns:cx="http://schemas.microsoft.com/office/drawing/2014/chartex" xmlns:cx1="http://schemas.microsoft.com/office/drawing/2015/9/8/chartex" xmlns:cx2="http://schemas.microsoft.com/office/drawing/2015/10/21/chartex" xmlns:cx3="http://schemas.microsoft.com/office/drawing/2016/5/9/chartex" xmlns:cx4="http://schemas.microsoft.com/office/drawing/2016/5/10/chartex" xmlns:cx5="http://schemas.microsoft.com/office/drawing/2016/5/11/chartex" xmlns:cx6="http://schemas.microsoft.com/office/drawing/2016/5/12/chartex" xmlns:cx7="http://schemas.microsoft.com/office/drawing/2016/5/13/chartex" xmlns:cx8="http://schemas.microsoft.com/office/drawing/2016/5/14/chartex" xmlns:mc="http://schemas.openxmlformats.org/markup-compatibility/2006" xmlns:aink="http://schemas.microsoft.com/office/drawing/2016/ink" xmlns:am3d="http://schemas.microsoft.com/office/drawing/2017/model3d" xmlns:o="urn:schemas-microsoft-com:office:office" xmlns:oel="http://schemas.microsoft.com/office/2019/extlst" xmlns:r="http://schemas.openxmlformats.org/officeDocument/2006/relationships" xmlns:m="http://schemas.openxmlformats.org/officeDocument/2006/math" xmlns:v="urn:schemas-microsoft-com:vml" xmlns:wp14="http://schemas.microsoft.com/office/word/2010/wordprocessingDrawing" xmlns:wp="http://schemas.openxmlformats.org/drawingml/2006/wordprocessingDrawing" xmlns:w10="urn:schemas-microsoft-com:office:word" xmlns:w="http://schemas.openxmlformats.org/wordprocessingml/2006/main" xmlns:w14="http://schemas.microsoft.com/office/word/2010/wordml" xmlns:w15="http://schemas.microsoft.com/office/word/2012/wordml" xmlns:w16cex="http://schemas.microsoft.com/office/word/2018/wordml/cex" xmlns:w16cid="http://schemas.microsoft.com/office/word/2016/wordml/cid" xmlns:w16="http://schemas.microsoft.com/office/word/2018/wordml" xmlns:w16du="http://schemas.microsoft.com/office/word/2023/wordml/word16du" xmlns:w16sdtdh="http://schemas.microsoft.com/office/word/2020/wordml/sdtdatahash" xmlns:w16sdtfl="http://schemas.microsoft.com/office/word/2024/wordml/sdtformatlock" xmlns:w16se="http://schemas.microsoft.com/office/word/2015/wordml/symex" xmlns:wpg="http://schemas.microsoft.com/office/word/2010/wordprocessingGroup" xmlns:wpi="http://schemas.microsoft.com/office/word/2010/wordprocessingInk" xmlns:wne="http://schemas.microsoft.com/office/word/2006/wordml" xmlns:wps="http://schemas.microsoft.com/office/word/2010/wordprocessingShape" mc:Ignorable="w14 w15 w16se w16cid w16 w16cex w16sdtdh w16sdtfl w16du wp14">
+  <w:p>
+    <w:pPr>
+      <w:pStyle w:val="Header"/>
+    </w:pPr>
+  </w:p>
+</w:hdr>
+</file>
+
+<file path=word/numbering.xml><?xml version="1.0" encoding="utf-8"?>
+<w:numbering xmlns:wpc="http://schemas.microsoft.com/office/word/2010/wordprocessingCanvas" xmlns:cx="http://schemas.microsoft.com/office/drawing/2014/chartex" xmlns:cx1="http://schemas.microsoft.com/office/drawing/2015/9/8/chartex" xmlns:cx2="http://schemas.microsoft.com/office/drawing/2015/10/21/chartex" xmlns:cx3="http://schemas.microsoft.com/office/drawing/2016/5/9/chartex" xmlns:cx4="http://schemas.microsoft.com/office/drawing/2016/5/10/chartex" xmlns:cx5="http://schemas.microsoft.com/office/drawing/2016/5/11/chartex" xmlns:cx6="http://schemas.microsoft.com/office/drawing/2016/5/12/chartex" xmlns:cx7="http://schemas.microsoft.com/office/drawing/2016/5/13/chartex" xmlns:cx8="http://schemas.microsoft.com/office/drawing/2016/5/14/chartex" xmlns:mc="http://schemas.openxmlformats.org/markup-compatibility/2006" xmlns:aink="http://schemas.microsoft.com/office/drawing/2016/ink" xmlns:am3d="http://schemas.microsoft.com/office/drawing/2017/model3d" xmlns:o="urn:schemas-microsoft-com:office:office" xmlns:oel="http://schemas.microsoft.com/office/2019/extlst" xmlns:r="http://schemas.openxmlformats.org/officeDocument/2006/relationships" xmlns:m="http://schemas.openxmlformats.org/officeDocument/2006/math" xmlns:v="urn:schemas-microsoft-com:vml" xmlns:wp14="http://schemas.microsoft.com/office/word/2010/wordprocessingDrawing" xmlns:wp="http://schemas.openxmlformats.org/drawingml/2006/wordprocessingDrawing" xmlns:w10="urn:schemas-microsoft-com:office:word" xmlns:w="http://schemas.openxmlformats.org/wordprocessingml/2006/main" xmlns:w14="http://schemas.microsoft.com/office/word/2010/wordml" xmlns:w15="http://schemas.microsoft.com/office/word/2012/wordml" xmlns:w16cex="http://schemas.microsoft.com/office/word/2018/wordml/cex" xmlns:w16cid="http://schemas.microsoft.com/office/word/2016/wordml/cid" xmlns:w16="http://schemas.microsoft.com/office/word/2018/wordml" xmlns:w16du="http://schemas.microsoft.com/office/word/2023/wordml/word16du" xmlns:w16sdtdh="http://schemas.microsoft.com/office/word/2020/wordml/sdtdatahash" xmlns:w16sdtfl="http://schemas.microsoft.com/office/word/2024/wordml/sdtformatlock" xmlns:w16se="http://schemas.microsoft.com/office/word/2015/wordml/symex" xmlns:wpg="http://schemas.microsoft.com/office/word/2010/wordprocessingGroup" xmlns:wpi="http://schemas.microsoft.com/office/word/2010/wordprocessingInk" xmlns:wne="http://schemas.microsoft.com/office/word/2006/wordml" xmlns:wps="http://schemas.microsoft.com/office/word/2010/wordprocessingShape" mc:Ignorable="w14 w15 w16se w16cid w16 w16cex w16sdtdh w16sdtfl w16du wp14">
+  <w:abstractNum w:abstractNumId="0" w15:restartNumberingAfterBreak="0">
+    <w:nsid w:val="FFFFFF89"/>
+    <w:multiLevelType w:val="singleLevel"/>
+    <w:tmpl w:val="9C62CCF0"/>
+    <w:lvl w:ilvl="0">
+      <w:start w:val="1"/>
+      <w:numFmt w:val="bullet"/>
+      <w:pStyle w:val="ListBullet"/>
+      <w:lvlText w:val=""/>
+      <w:lvlJc w:val="left"/>
+      <w:pPr>
+        <w:tabs>
+          <w:tab w:val="num" w:pos="360"/>
+        </w:tabs>
+        <w:ind w:left="360" w:hanging="360"/>
+      </w:pPr>
+      <w:rPr>
+        <w:rFonts w:ascii="Symbol" w:hAnsi="Symbol" w:hint="default"/>
+      </w:rPr>
+    </w:lvl>
+  </w:abstractNum>
+  <w:num w:numId="1" w16cid:durableId="1675066227">
+    <w:abstractNumId w:val="0"/>
+  </w:num>
+</w:numbering>
 </file>
 
 <file path=word/styles.xml><?xml version="1.0" encoding="utf-8"?>
@@ -1203,7 +1410,6 @@
     <w:next w:val="Normal"/>
     <w:link w:val="Heading2Char"/>
     <w:uiPriority w:val="9"/>
-    <w:semiHidden/>
     <w:unhideWhenUsed/>
     <w:qFormat/>
     <w:rsid w:val="00B864B0"/>
@@ -1420,7 +1626,6 @@
     <w:basedOn w:val="DefaultParagraphFont"/>
     <w:link w:val="Heading2"/>
     <w:uiPriority w:val="9"/>
-    <w:semiHidden/>
     <w:rsid w:val="00B864B0"/>
     <w:rPr>
       <w:rFonts w:asciiTheme="majorHAnsi" w:eastAsiaTheme="majorEastAsia" w:hAnsiTheme="majorHAnsi" w:cstheme="majorBidi"/>
@@ -1713,6 +1918,82 @@
     <w:rPr>
       <w:color w:val="605E5C"/>
       <w:shd w:val="clear" w:color="auto" w:fill="E1DFDD"/>
+    </w:rPr>
+  </w:style>
+  <w:style w:type="paragraph" w:styleId="Header">
+    <w:name w:val="header"/>
+    <w:basedOn w:val="Normal"/>
+    <w:link w:val="HeaderChar"/>
+    <w:uiPriority w:val="99"/>
+    <w:unhideWhenUsed/>
+    <w:rsid w:val="00730953"/>
+    <w:pPr>
+      <w:tabs>
+        <w:tab w:val="center" w:pos="4680"/>
+        <w:tab w:val="right" w:pos="9360"/>
+      </w:tabs>
+      <w:spacing w:after="0" w:line="240" w:lineRule="auto"/>
+    </w:pPr>
+  </w:style>
+  <w:style w:type="character" w:customStyle="1" w:styleId="HeaderChar">
+    <w:name w:val="Header Char"/>
+    <w:basedOn w:val="DefaultParagraphFont"/>
+    <w:link w:val="Header"/>
+    <w:uiPriority w:val="99"/>
+    <w:rsid w:val="00730953"/>
+  </w:style>
+  <w:style w:type="paragraph" w:styleId="Footer">
+    <w:name w:val="footer"/>
+    <w:basedOn w:val="Normal"/>
+    <w:link w:val="FooterChar"/>
+    <w:uiPriority w:val="99"/>
+    <w:unhideWhenUsed/>
+    <w:rsid w:val="00730953"/>
+    <w:pPr>
+      <w:tabs>
+        <w:tab w:val="center" w:pos="4680"/>
+        <w:tab w:val="right" w:pos="9360"/>
+      </w:tabs>
+      <w:spacing w:after="0" w:line="240" w:lineRule="auto"/>
+    </w:pPr>
+  </w:style>
+  <w:style w:type="character" w:customStyle="1" w:styleId="FooterChar">
+    <w:name w:val="Footer Char"/>
+    <w:basedOn w:val="DefaultParagraphFont"/>
+    <w:link w:val="Footer"/>
+    <w:uiPriority w:val="99"/>
+    <w:rsid w:val="00730953"/>
+  </w:style>
+  <w:style w:type="paragraph" w:styleId="ListBullet">
+    <w:name w:val="List Bullet"/>
+    <w:basedOn w:val="Normal"/>
+    <w:uiPriority w:val="99"/>
+    <w:unhideWhenUsed/>
+    <w:rsid w:val="00730953"/>
+    <w:pPr>
+      <w:numPr>
+        <w:numId w:val="1"/>
+      </w:numPr>
+      <w:contextualSpacing/>
+    </w:pPr>
+  </w:style>
+  <w:style w:type="paragraph" w:styleId="Caption">
+    <w:name w:val="caption"/>
+    <w:basedOn w:val="Normal"/>
+    <w:next w:val="Normal"/>
+    <w:uiPriority w:val="35"/>
+    <w:unhideWhenUsed/>
+    <w:qFormat/>
+    <w:rsid w:val="00730953"/>
+    <w:pPr>
+      <w:spacing w:after="200" w:line="240" w:lineRule="auto"/>
+    </w:pPr>
+    <w:rPr>
+      <w:i/>
+      <w:iCs/>
+      <w:color w:val="44546A" w:themeColor="text2"/>
+      <w:sz w:val="18"/>
+      <w:szCs w:val="18"/>
     </w:rPr>
   </w:style>
 </w:styles>
@@ -2011,4 +2292,26 @@
     </a:ext>
   </a:extLst>
 </a:theme>
+</file>
+
+<file path=word/webextensions/taskpanes.xml><?xml version="1.0" encoding="utf-8"?>
+<wetp:taskpanes xmlns:wetp="http://schemas.microsoft.com/office/webextensions/taskpanes/2010/11">
+  <wetp:taskpane dockstate="right" visibility="0" width="350" row="0">
+    <wetp:webextensionref xmlns:r="http://schemas.openxmlformats.org/officeDocument/2006/relationships" r:id="rId1"/>
+  </wetp:taskpane>
+</wetp:taskpanes>
+</file>
+
+<file path=word/webextensions/webextension1.xml><?xml version="1.0" encoding="utf-8"?>
+<we:webextension xmlns:we="http://schemas.microsoft.com/office/webextensions/webextension/2010/11" id="{18629F3B-F663-40E9-A720-9C7B78F56446}">
+  <we:reference id="wa200010453" version="1.0.0.1" store="en-US" storeType="OMEX"/>
+  <we:alternateReferences>
+    <we:reference id="WA200010453" version="1.0.0.1" store="" storeType="OMEX"/>
+  </we:alternateReferences>
+  <we:properties>
+    <we:property name="claude.fileId" value="&quot;d8504ae5-cfbc-44d6-b874-0d5ac8c0e62f&quot;"/>
+  </we:properties>
+  <we:bindings/>
+  <we:snapshot xmlns:r="http://schemas.openxmlformats.org/officeDocument/2006/relationships"/>
+</we:webextension>
 </file>
</xml_diff>

<commit_message>
Add live backend APIs, fix OT/ICS data leak, and build Control Advisor tool
- Add FastAPI live-scoring endpoints for RegMap, Identity Anomaly, and
  OT/ICS, containerized together in one Docker image (backend/)
- Fix a data leak in the OT/ICS autoencoder (attack labels were being used
  as input features); retrain and correct the honest recall (84.3%, down
  from an inflated 100%) throughout the README, notebook, and exhibits
- Correct factual errors across the NIW exhibits: stale/contradictory
  metrics, an unfilled placeholder, a wrong notebook filename, and a
  broken GitHub repo link
- Add Control Advisor (control-advisor/): a new NIST 800-53 control
  recommendation tool that scans local/WAN networks and cloud
  (AWS/LocalStack) environments, conducts an LLM-driven natural-language
  interview to gather environment context, and generates prioritized
  DOCX/XLSX reports with drafted policy language
</commit_message>
<xml_diff>
--- a/exhibits/Exhibit 12_hybrid _indentity.md.docx
+++ b/exhibits/Exhibit 12_hybrid _indentity.md.docx
@@ -3,19 +3,55 @@
 <w:document xmlns:wpc="http://schemas.microsoft.com/office/word/2010/wordprocessingCanvas" xmlns:cx="http://schemas.microsoft.com/office/drawing/2014/chartex" xmlns:cx1="http://schemas.microsoft.com/office/drawing/2015/9/8/chartex" xmlns:cx2="http://schemas.microsoft.com/office/drawing/2015/10/21/chartex" xmlns:cx3="http://schemas.microsoft.com/office/drawing/2016/5/9/chartex" xmlns:cx4="http://schemas.microsoft.com/office/drawing/2016/5/10/chartex" xmlns:cx5="http://schemas.microsoft.com/office/drawing/2016/5/11/chartex" xmlns:cx6="http://schemas.microsoft.com/office/drawing/2016/5/12/chartex" xmlns:cx7="http://schemas.microsoft.com/office/drawing/2016/5/13/chartex" xmlns:cx8="http://schemas.microsoft.com/office/drawing/2016/5/14/chartex" xmlns:mc="http://schemas.openxmlformats.org/markup-compatibility/2006" xmlns:aink="http://schemas.microsoft.com/office/drawing/2016/ink" xmlns:am3d="http://schemas.microsoft.com/office/drawing/2017/model3d" xmlns:o="urn:schemas-microsoft-com:office:office" xmlns:oel="http://schemas.microsoft.com/office/2019/extlst" xmlns:r="http://schemas.openxmlformats.org/officeDocument/2006/relationships" xmlns:m="http://schemas.openxmlformats.org/officeDocument/2006/math" xmlns:v="urn:schemas-microsoft-com:vml" xmlns:wp14="http://schemas.microsoft.com/office/word/2010/wordprocessingDrawing" xmlns:wp="http://schemas.openxmlformats.org/drawingml/2006/wordprocessingDrawing" xmlns:w10="urn:schemas-microsoft-com:office:word" xmlns:w="http://schemas.openxmlformats.org/wordprocessingml/2006/main" xmlns:w14="http://schemas.microsoft.com/office/word/2010/wordml" xmlns:w15="http://schemas.microsoft.com/office/word/2012/wordml" xmlns:w16cex="http://schemas.microsoft.com/office/word/2018/wordml/cex" xmlns:w16cid="http://schemas.microsoft.com/office/word/2016/wordml/cid" xmlns:w16="http://schemas.microsoft.com/office/word/2018/wordml" xmlns:w16du="http://schemas.microsoft.com/office/word/2023/wordml/word16du" xmlns:w16sdtdh="http://schemas.microsoft.com/office/word/2020/wordml/sdtdatahash" xmlns:w16sdtfl="http://schemas.microsoft.com/office/word/2024/wordml/sdtformatlock" xmlns:w16se="http://schemas.microsoft.com/office/word/2015/wordml/symex" xmlns:wpg="http://schemas.microsoft.com/office/word/2010/wordprocessingGroup" xmlns:wpi="http://schemas.microsoft.com/office/word/2010/wordprocessingInk" xmlns:wne="http://schemas.microsoft.com/office/word/2006/wordml" xmlns:wps="http://schemas.microsoft.com/office/word/2010/wordprocessingShape" mc:Ignorable="w14 w15 w16se w16cid w16 w16cex w16sdtdh w16sdtfl w16du wp14">
   <w:body>
     <w:p>
-      <w:r>
-        <w:t xml:space="preserve"> Exhibit 12: Hybrid Identity Anomaly Detection – LANL Authentication Logs</w:t>
-      </w:r>
-    </w:p>
-    <w:p/>
-    <w:p>
-      <w:r>
-        <w:t xml:space="preserve">Petitioner: Samuel Gbli Tetteh  </w:t>
-      </w:r>
-    </w:p>
-    <w:p>
-      <w:r>
-        <w:t>NIW Proposed Endeavor Pathway 1: Context</w:t>
+      <w:pPr>
+        <w:pStyle w:val="Title"/>
+        <w:jc w:val="center"/>
+        <w:rPr>
+          <w:sz w:val="48"/>
+          <w:szCs w:val="48"/>
+        </w:rPr>
+      </w:pPr>
+      <w:r>
+        <w:rPr>
+          <w:sz w:val="48"/>
+          <w:szCs w:val="48"/>
+        </w:rPr>
+        <w:t>Exhibit 12: Hybrid Identity Anomaly Detection – LANL Authentication Logs</w:t>
+      </w:r>
+    </w:p>
+    <w:p/>
+    <w:p>
+      <w:pPr>
+        <w:pStyle w:val="Subtitle"/>
+        <w:jc w:val="center"/>
+      </w:pPr>
+      <w:r>
+        <w:t>Petitioner: Samuel Gbli Tetteh</w:t>
+      </w:r>
+    </w:p>
+    <w:p>
+      <w:pPr>
+        <w:pStyle w:val="Subtitle"/>
+        <w:jc w:val="center"/>
+      </w:pPr>
+      <w:r>
+        <w:t>NIW Proposed Endeavor — Pathway 1: Context-aware anomaly detection models for hybrid identity systems</w:t>
+      </w:r>
+    </w:p>
+    <w:p/>
+    <w:p/>
+    <w:p>
+      <w:pPr>
+        <w:pStyle w:val="Heading1"/>
+      </w:pPr>
+      <w:r>
+        <w:t>1. Project Summary</w:t>
+      </w:r>
+    </w:p>
+    <w:p/>
+    <w:p>
+      <w:r>
+        <w:t>This project implements an unsupervised anomaly detection system that analyzes authentication logs to flag suspicious user behavior in a hybrid (cloud + on</w:t>
       </w:r>
       <w:r>
         <w:rPr>
@@ -24,20 +60,16 @@
         <w:t>‑</w:t>
       </w:r>
       <w:r>
-        <w:t>aware anomaly detection models for hybrid identity systems</w:t>
-      </w:r>
-    </w:p>
-    <w:p/>
-    <w:p/>
-    <w:p>
-      <w:r>
-        <w:t xml:space="preserve"> 1. Project Summary</w:t>
-      </w:r>
-    </w:p>
-    <w:p/>
-    <w:p>
-      <w:r>
-        <w:t>This project implements an unsupervised anomaly detection system that analyzes authentication logs to flag suspicious user behavior in a hybrid (cloud + on</w:t>
+        <w:t>premises) identity environment. It uses the publicly available LANL Comprehensive Cyber Security Events dataset and trains an Isolation Forest model to identify unusual login patterns</w:t>
+      </w:r>
+      <w:r>
+        <w:rPr>
+          <w:rFonts w:ascii="Calibri" w:hAnsi="Calibri" w:cs="Calibri"/>
+        </w:rPr>
+        <w:t>—</w:t>
+      </w:r>
+      <w:r>
+        <w:t>exactly the type of context</w:t>
       </w:r>
       <w:r>
         <w:rPr>
@@ -46,16 +78,32 @@
         <w:t>‑</w:t>
       </w:r>
       <w:r>
-        <w:t>premises) identity environment. It uses the publicly available LANL Comprehensive Cyber Security Events dataset and trains an Isolation Forest model to identify unusual login patterns</w:t>
+        <w:t>aware detection described in my proposed endeavor</w:t>
       </w:r>
       <w:r>
         <w:rPr>
           <w:rFonts w:ascii="Calibri" w:hAnsi="Calibri" w:cs="Calibri"/>
         </w:rPr>
-        <w:t>—</w:t>
-      </w:r>
-      <w:r>
-        <w:t>exactly the type of context</w:t>
+        <w:t>’</w:t>
+      </w:r>
+      <w:r>
+        <w:t>s first research pathway.</w:t>
+      </w:r>
+    </w:p>
+    <w:p/>
+    <w:p/>
+    <w:p>
+      <w:pPr>
+        <w:pStyle w:val="Heading1"/>
+      </w:pPr>
+      <w:r>
+        <w:t>2. Alignment with Proposed Endeavor</w:t>
+      </w:r>
+    </w:p>
+    <w:p/>
+    <w:p>
+      <w:r>
+        <w:t>In my personal statement, I committed to developing context</w:t>
       </w:r>
       <w:r>
         <w:rPr>
@@ -64,34 +112,16 @@
         <w:t>‑</w:t>
       </w:r>
       <w:r>
-        <w:t>aware detection described in my proposed endeavor</w:t>
-      </w:r>
-      <w:r>
-        <w:rPr>
-          <w:rFonts w:ascii="Calibri" w:hAnsi="Calibri" w:cs="Calibri"/>
-        </w:rPr>
-        <w:t>’</w:t>
-      </w:r>
-      <w:r>
-        <w:t>s first research pathway.</w:t>
-      </w:r>
-    </w:p>
-    <w:p/>
-    <w:p>
-      <w:r>
-        <w:t>---</w:t>
-      </w:r>
-    </w:p>
-    <w:p/>
-    <w:p>
-      <w:r>
-        <w:t xml:space="preserve"> 2. Alignment with Proposed Endeavor</w:t>
-      </w:r>
-    </w:p>
-    <w:p/>
-    <w:p>
-      <w:r>
-        <w:t>In my personal statement, I committed to developing context</w:t>
+        <w:t>aware anomaly detection models specifically tailored for hybrid identity systems. This prototype directly addresses that goal:</w:t>
+      </w:r>
+    </w:p>
+    <w:p/>
+    <w:p>
+      <w:pPr>
+        <w:pStyle w:val="ListBullet"/>
+      </w:pPr>
+      <w:r>
+        <w:t>It ingests real</w:t>
       </w:r>
       <w:r>
         <w:rPr>
@@ -100,13 +130,38 @@
         <w:t>‑</w:t>
       </w:r>
       <w:r>
-        <w:t>aware anomaly detection models specifically tailored for hybrid identity systems. This prototype directly addresses that goal:</w:t>
-      </w:r>
-    </w:p>
-    <w:p/>
-    <w:p>
-      <w:r>
-        <w:t>- It ingests real</w:t>
+        <w:t>world authentication logs (timestamp, user, source PC, logon type).</w:t>
+      </w:r>
+    </w:p>
+    <w:p>
+      <w:pPr>
+        <w:pStyle w:val="ListBullet"/>
+      </w:pPr>
+      <w:r>
+        <w:t>It engineers context features: time of day, day of week, weekend flag, user activity frequency, and PC diversity.</w:t>
+      </w:r>
+    </w:p>
+    <w:p>
+      <w:pPr>
+        <w:pStyle w:val="ListBullet"/>
+      </w:pPr>
+      <w:r>
+        <w:t>It deploys an unsupervised Isolation Forest to detect deviations from normal behavior without labeled attack data.</w:t>
+      </w:r>
+    </w:p>
+    <w:p>
+      <w:pPr>
+        <w:pStyle w:val="ListBullet"/>
+      </w:pPr>
+      <w:r>
+        <w:t>It identifies outliers that could represent credential theft, lateral movement, or misconfigurations.</w:t>
+      </w:r>
+    </w:p>
+    <w:p/>
+    <w:p>
+      <w:r>
+        <w:lastRenderedPageBreak/>
+        <w:t>The project proves my ability to build ML</w:t>
       </w:r>
       <w:r>
         <w:rPr>
@@ -115,28 +170,34 @@
         <w:t>‑</w:t>
       </w:r>
       <w:r>
-        <w:t>world authentication logs (timestamp, user, source PC, logon type).</w:t>
-      </w:r>
-    </w:p>
-    <w:p>
-      <w:r>
-        <w:t>- It engineers context features: time of day, day of week, weekend flag, user activity frequency, and PC diversity.</w:t>
-      </w:r>
-    </w:p>
-    <w:p>
-      <w:r>
-        <w:t>- It deploys an unsupervised Isolation Forest to detect deviations from normal behavior without labeled attack data.</w:t>
-      </w:r>
-    </w:p>
-    <w:p>
-      <w:r>
-        <w:t>- It identifies outliers that could represent credential theft, lateral movement, or misconfigurations.</w:t>
-      </w:r>
-    </w:p>
-    <w:p/>
-    <w:p>
-      <w:r>
-        <w:t>The project proves my ability to build ML</w:t>
+        <w:t>driven security analytics for hybrid identity environments using open data and tools.</w:t>
+      </w:r>
+    </w:p>
+    <w:p/>
+    <w:p/>
+    <w:p>
+      <w:pPr>
+        <w:pStyle w:val="Heading1"/>
+      </w:pPr>
+      <w:r>
+        <w:t>3. Technical Implementation</w:t>
+      </w:r>
+    </w:p>
+    <w:p/>
+    <w:p>
+      <w:pPr>
+        <w:pStyle w:val="Heading2"/>
+      </w:pPr>
+      <w:r>
+        <w:t>3.1 Dataset</w:t>
+      </w:r>
+    </w:p>
+    <w:p>
+      <w:pPr>
+        <w:pStyle w:val="ListBullet"/>
+      </w:pPr>
+      <w:r>
+        <w:t>Source: LANL Comprehensive, Multi</w:t>
       </w:r>
       <w:r>
         <w:rPr>
@@ -145,31 +206,23 @@
         <w:t>‑</w:t>
       </w:r>
       <w:r>
-        <w:t>driven security analytics for hybrid identity environments using open data and tools.</w:t>
-      </w:r>
-    </w:p>
-    <w:p/>
-    <w:p>
-      <w:r>
-        <w:lastRenderedPageBreak/>
-        <w:t>---</w:t>
-      </w:r>
-    </w:p>
-    <w:p/>
-    <w:p>
-      <w:r>
-        <w:t xml:space="preserve"> 3. Technical Implementation</w:t>
-      </w:r>
-    </w:p>
-    <w:p/>
-    <w:p>
-      <w:r>
-        <w:t xml:space="preserve"> 3.1 Dataset</w:t>
-      </w:r>
-    </w:p>
-    <w:p>
-      <w:r>
-        <w:t>- Source: LANL Comprehensive, Multi</w:t>
+        <w:t>source Cyber Security Events (public).</w:t>
+      </w:r>
+    </w:p>
+    <w:p>
+      <w:pPr>
+        <w:pStyle w:val="ListBullet"/>
+      </w:pPr>
+      <w:r>
+        <w:t>Size: 2,000,000 authentication events, 7,399 unique users, 4,157 unique source PCs.</w:t>
+      </w:r>
+    </w:p>
+    <w:p>
+      <w:pPr>
+        <w:pStyle w:val="ListBullet"/>
+      </w:pPr>
+      <w:r>
+        <w:t>Processing: Data was processed using Polars (a high</w:t>
       </w:r>
       <w:r>
         <w:rPr>
@@ -178,34 +231,6 @@
         <w:t>‑</w:t>
       </w:r>
       <w:r>
-        <w:t>source Cyber Security Events (public).</w:t>
-      </w:r>
-    </w:p>
-    <w:p>
-      <w:r>
-        <w:t xml:space="preserve">- </w:t>
-      </w:r>
-      <w:r>
-        <w:t>Size:</w:t>
-      </w:r>
-      <w:r>
-        <w:t xml:space="preserve"> </w:t>
-      </w:r>
-      <w:r>
-        <w:t>2,000,000 authentication events, 7,399 unique users, 4,157 unique source PCs.</w:t>
-      </w:r>
-    </w:p>
-    <w:p>
-      <w:r>
-        <w:t>- Processing: Data was processed using Polars (a high</w:t>
-      </w:r>
-      <w:r>
-        <w:rPr>
-          <w:rFonts w:ascii="Cambria Math" w:hAnsi="Cambria Math" w:cs="Cambria Math"/>
-        </w:rPr>
-        <w:t>‑</w:t>
-      </w:r>
-      <w:r>
         <w:t xml:space="preserve">performance </w:t>
       </w:r>
       <w:proofErr w:type="spellStart"/>
@@ -218,30 +243,45 @@
       </w:r>
     </w:p>
     <w:p>
-      <w:r>
-        <w:t>- Features engineered: Hour, day of week, weekend indicator, hourly login count per user, unique PC count per user, logon type encoding.</w:t>
-      </w:r>
-    </w:p>
-    <w:p/>
-    <w:p>
-      <w:r>
-        <w:t xml:space="preserve"> 3.2 Model</w:t>
-      </w:r>
-    </w:p>
-    <w:p>
-      <w:r>
-        <w:t>- Algorithm: Isolation Forest (contamination=0.01, 100 estimators).</w:t>
-      </w:r>
-    </w:p>
-    <w:p>
-      <w:r>
-        <w:t>- Approach: Features were standardized; the model was trained unsupervised to assign anomaly scores.</w:t>
-      </w:r>
-    </w:p>
-    <w:p/>
-    <w:p>
-      <w:r>
-        <w:t xml:space="preserve"> 3.3 Key Results</w:t>
+      <w:pPr>
+        <w:pStyle w:val="ListBullet"/>
+      </w:pPr>
+      <w:r>
+        <w:t>Features engineered: Hour, day of week, weekend indicator, hourly login count per user, unique PC count per user, logon type encoding.</w:t>
+      </w:r>
+    </w:p>
+    <w:p/>
+    <w:p>
+      <w:pPr>
+        <w:pStyle w:val="Heading2"/>
+      </w:pPr>
+      <w:r>
+        <w:t>3.2 Model</w:t>
+      </w:r>
+    </w:p>
+    <w:p>
+      <w:pPr>
+        <w:pStyle w:val="ListBullet"/>
+      </w:pPr>
+      <w:r>
+        <w:t>Algorithm: Isolation Forest (contamination=0.01, 100 estimators).</w:t>
+      </w:r>
+    </w:p>
+    <w:p>
+      <w:pPr>
+        <w:pStyle w:val="ListBullet"/>
+      </w:pPr>
+      <w:r>
+        <w:t>Approach: Features were standardized; the model was trained unsupervised to assign anomaly scores.</w:t>
+      </w:r>
+    </w:p>
+    <w:p/>
+    <w:p>
+      <w:pPr>
+        <w:pStyle w:val="Heading2"/>
+      </w:pPr>
+      <w:r>
+        <w:t>3.3 Key Results</w:t>
       </w:r>
     </w:p>
     <w:p>
@@ -473,14 +513,21 @@
       </w:pPr>
     </w:p>
     <w:p>
-      <w:r>
-        <w:t>Figure: Summary output from the completed notebook.</w:t>
-      </w:r>
-    </w:p>
-    <w:p/>
-    <w:p>
-      <w:r>
-        <w:t xml:space="preserve"> 3.4 Reproducibility</w:t>
+      <w:pPr>
+        <w:pStyle w:val="Caption"/>
+        <w:jc w:val="center"/>
+      </w:pPr>
+      <w:r>
+        <w:t>Figure 1. Summary output from the completed notebook.</w:t>
+      </w:r>
+    </w:p>
+    <w:p/>
+    <w:p>
+      <w:pPr>
+        <w:pStyle w:val="Heading2"/>
+      </w:pPr>
+      <w:r>
+        <w:t>3.4 Reproducibility</w:t>
       </w:r>
     </w:p>
     <w:p>
@@ -489,52 +536,52 @@
       </w:r>
     </w:p>
     <w:p>
-      <w:hyperlink r:id="rId4" w:history="1">
-        <w:r>
-          <w:rPr>
-            <w:rStyle w:val="Hyperlink"/>
-          </w:rPr>
-          <w:t>[Insert your GitHub repo URL here]</w:t>
-        </w:r>
-      </w:hyperlink>
-      <w:r>
-        <w:t xml:space="preserve"> - </w:t>
-      </w:r>
-      <w:r>
-        <w:t>https://github.com/samuelgtetteh/Samuel_Tetteh_Dev-V2_Restart</w:t>
-      </w:r>
-    </w:p>
-    <w:p/>
-    <w:p>
       <w:r>
         <w:lastRenderedPageBreak/>
-        <w:t xml:space="preserve"> 4. Visual Evidence</w:t>
-      </w:r>
-    </w:p>
-    <w:p/>
-    <w:p>
-      <w:r>
-        <w:t xml:space="preserve"> 4.1 Notebook Summary Output</w:t>
-      </w:r>
-    </w:p>
-    <w:p>
-      <w:r>
-        <w:t xml:space="preserve">![Summary metrics](Exhibit12a_summary.png)  </w:t>
-      </w:r>
-    </w:p>
-    <w:p>
-      <w:r>
-        <w:t>Caption: Output of the summary cell showing dataset size, anomaly count, and top anomalous user.</w:t>
-      </w:r>
-    </w:p>
-    <w:p/>
-    <w:p>
-      <w:r>
-        <w:t xml:space="preserve"> 4.2 Anomaly Visualization (if available)</w:t>
-      </w:r>
-    </w:p>
-    <w:p>
-      <w:r>
+        <w:t>https://github.com/samuelgtetteh/ai-cybersecurity-portfolio</w:t>
+      </w:r>
+    </w:p>
+    <w:p/>
+    <w:p>
+      <w:pPr>
+        <w:pStyle w:val="Heading1"/>
+      </w:pPr>
+      <w:r>
+        <w:t>4. Visual Evidence</w:t>
+      </w:r>
+    </w:p>
+    <w:p/>
+    <w:p>
+      <w:pPr>
+        <w:pStyle w:val="Heading2"/>
+      </w:pPr>
+      <w:r>
+        <w:t>4.1 Notebook Summary Output</w:t>
+      </w:r>
+    </w:p>
+    <w:p>
+      <w:pPr>
+        <w:pStyle w:val="Caption"/>
+        <w:jc w:val="center"/>
+      </w:pPr>
+      <w:r>
+        <w:t>Figure 2. Summary cell output — dataset size, anomaly count, and top anomalous user.</w:t>
+      </w:r>
+    </w:p>
+    <w:p/>
+    <w:p>
+      <w:pPr>
+        <w:pStyle w:val="Heading2"/>
+      </w:pPr>
+      <w:r>
+        <w:t>4.2 Anomaly Visualization</w:t>
+      </w:r>
+    </w:p>
+    <w:p>
+      <w:r>
+        <w:rPr>
+          <w:noProof/>
+        </w:rPr>
         <w:drawing>
           <wp:inline distT="0" distB="0" distL="0" distR="0" wp14:anchorId="3A4BFE13" wp14:editId="7B236B53">
             <wp:extent cx="4425968" cy="3483558"/>
@@ -551,7 +598,7 @@
                     <pic:cNvPicPr/>
                   </pic:nvPicPr>
                   <pic:blipFill>
-                    <a:blip r:embed="rId5"/>
+                    <a:blip r:embed="rId7"/>
                     <a:stretch>
                       <a:fillRect/>
                     </a:stretch>
@@ -574,6 +621,9 @@
     </w:p>
     <w:p>
       <w:r>
+        <w:rPr>
+          <w:noProof/>
+        </w:rPr>
         <w:lastRenderedPageBreak/>
         <w:drawing>
           <wp:inline distT="0" distB="0" distL="0" distR="0" wp14:anchorId="7B349266" wp14:editId="7ECAEED2">
@@ -591,7 +641,7 @@
                     <pic:cNvPicPr/>
                   </pic:nvPicPr>
                   <pic:blipFill>
-                    <a:blip r:embed="rId6"/>
+                    <a:blip r:embed="rId8"/>
                     <a:stretch>
                       <a:fillRect/>
                     </a:stretch>
@@ -612,6 +662,9 @@
         </w:drawing>
       </w:r>
       <w:r>
+        <w:rPr>
+          <w:noProof/>
+        </w:rPr>
         <w:drawing>
           <wp:inline distT="0" distB="0" distL="0" distR="0" wp14:anchorId="671DF26F" wp14:editId="37661A0B">
             <wp:extent cx="5943600" cy="3115945"/>
@@ -628,7 +681,7 @@
                     <pic:cNvPicPr/>
                   </pic:nvPicPr>
                   <pic:blipFill>
-                    <a:blip r:embed="rId7"/>
+                    <a:blip r:embed="rId9"/>
                     <a:stretch>
                       <a:fillRect/>
                     </a:stretch>
@@ -649,6 +702,9 @@
         </w:drawing>
       </w:r>
       <w:r>
+        <w:rPr>
+          <w:noProof/>
+        </w:rPr>
         <w:lastRenderedPageBreak/>
         <w:drawing>
           <wp:inline distT="0" distB="0" distL="0" distR="0" wp14:anchorId="70FB2904" wp14:editId="5A444C80">
@@ -666,7 +722,7 @@
                     <pic:cNvPicPr/>
                   </pic:nvPicPr>
                   <pic:blipFill>
-                    <a:blip r:embed="rId8"/>
+                    <a:blip r:embed="rId10"/>
                     <a:stretch>
                       <a:fillRect/>
                     </a:stretch>
@@ -688,20 +744,22 @@
       </w:r>
     </w:p>
     <w:p>
-      <w:r>
-        <w:t xml:space="preserve">![Anomaly distribution](Exhibit12b_plot.png)  </w:t>
-      </w:r>
-    </w:p>
-    <w:p>
-      <w:r>
-        <w:t>Caption: Plot of anomaly distribution, demonstrating the model’s detection capability.</w:t>
-      </w:r>
-    </w:p>
-    <w:p/>
-    <w:p/>
-    <w:p>
-      <w:r>
-        <w:t xml:space="preserve"> 5. Significance for the “Well Positioned” Prong</w:t>
+      <w:pPr>
+        <w:pStyle w:val="Caption"/>
+        <w:jc w:val="center"/>
+      </w:pPr>
+      <w:r>
+        <w:t>Figure 3. Anomaly distribution, demonstrating the model’s detection capability.</w:t>
+      </w:r>
+    </w:p>
+    <w:p/>
+    <w:p/>
+    <w:p>
+      <w:pPr>
+        <w:pStyle w:val="Heading1"/>
+      </w:pPr>
+      <w:r>
+        <w:t>5. Significance for the “Well Positioned” Prong</w:t>
       </w:r>
     </w:p>
     <w:p/>
@@ -712,8 +770,11 @@
     </w:p>
     <w:p/>
     <w:p>
-      <w:r>
-        <w:t>- Built a context</w:t>
+      <w:pPr>
+        <w:pStyle w:val="ListBullet"/>
+      </w:pPr>
+      <w:r>
+        <w:t>Built a context</w:t>
       </w:r>
       <w:r>
         <w:rPr>
@@ -726,18 +787,36 @@
       </w:r>
     </w:p>
     <w:p>
-      <w:r>
-        <w:t>- Trained and evaluated an unsupervised anomaly detector on 500,000 real authentication events.</w:t>
-      </w:r>
-    </w:p>
-    <w:p>
-      <w:r>
-        <w:t>- Produced a reusable model that can be deployed in a SIEM or identity analytics tool.</w:t>
-      </w:r>
-    </w:p>
-    <w:p>
-      <w:r>
-        <w:t>- Published the code and artifacts openly to benefit the broader security community.</w:t>
+      <w:pPr>
+        <w:pStyle w:val="ListBullet"/>
+      </w:pPr>
+      <w:r>
+        <w:t xml:space="preserve">Trained and evaluated an unsupervised anomaly detector on </w:t>
+      </w:r>
+      <w:r>
+        <w:rPr>
+          <w:rFonts w:ascii="Calibri" w:hAnsi="Calibri" w:cs="Calibri"/>
+        </w:rPr>
+        <w:t>2,000</w:t>
+      </w:r>
+      <w:r>
+        <w:t>,000 real authentication events.</w:t>
+      </w:r>
+    </w:p>
+    <w:p>
+      <w:pPr>
+        <w:pStyle w:val="ListBullet"/>
+      </w:pPr>
+      <w:r>
+        <w:t>Produced a reusable model that can be deployed in a SIEM or identity analytics tool.</w:t>
+      </w:r>
+    </w:p>
+    <w:p>
+      <w:pPr>
+        <w:pStyle w:val="ListBullet"/>
+      </w:pPr>
+      <w:r>
+        <w:t>Published the code and artifacts openly to benefit the broader security community.</w:t>
       </w:r>
     </w:p>
     <w:p/>
@@ -755,6 +834,61 @@
       </w:r>
     </w:p>
     <w:p/>
+    <w:p/>
+    <w:p>
+      <w:pPr>
+        <w:pStyle w:val="Heading1"/>
+      </w:pPr>
+      <w:r>
+        <w:lastRenderedPageBreak/>
+        <w:t>6. Path to Production: Live API Deployment</w:t>
+      </w:r>
+    </w:p>
+    <w:p>
+      <w:r>
+        <w:t>Beyond the batch-processing notebooks described above, I engineered this Isolation Forest model into a live, callable scoring service, demonstrating the transition from offline research to a system capable of evaluating authentication events in real time.</w:t>
+      </w:r>
+    </w:p>
+    <w:p>
+      <w:pPr>
+        <w:pStyle w:val="Heading2"/>
+      </w:pPr>
+      <w:r>
+        <w:t>6.1 From Batch to Real-Time Scoring</w:t>
+      </w:r>
+    </w:p>
+    <w:p>
+      <w:r>
+        <w:t>The trained model is served via a FastAPI microservice (POST /identity/score) that evaluates one login event at a time and returns an anomaly flag and score immediately. This required re-engineering two aspects of the original batch pipeline for live use: the hourly-login-count and unique-PC-count features, originally computed once over the entire historical dataset, are now maintained as live rolling counters that accumulate as real events stream in; and the categorical encodings (authentication type, logon type, etc.) are fixed and reproducible, recovered exactly from the original training data rather than being reassigned on each run.</w:t>
+      </w:r>
+    </w:p>
+    <w:p>
+      <w:pPr>
+        <w:pStyle w:val="Heading2"/>
+      </w:pPr>
+      <w:r>
+        <w:t>6.2 Containerized Deployment</w:t>
+      </w:r>
+    </w:p>
+    <w:p>
+      <w:r>
+        <w:t>The service is packaged into the same Docker image described in Exhibit 11, alongside the RegMap and OT/ICS Intrusion Detection APIs, producing a single reproducible deployment that serves all three research pathways in my proposed endeavor.</w:t>
+      </w:r>
+    </w:p>
+    <w:p>
+      <w:pPr>
+        <w:pStyle w:val="Heading2"/>
+      </w:pPr>
+      <w:r>
+        <w:t>6.3 Reproducibility</w:t>
+      </w:r>
+    </w:p>
+    <w:p>
+      <w:r>
+        <w:t>All source code for this API (backend/identity_api.py, backend/Dockerfile) is publicly available in the same GitHub repository referenced in Section 3.4.</w:t>
+      </w:r>
+    </w:p>
+    <w:p/>
     <w:p>
       <w:r>
         <w:t xml:space="preserve">Date: June 25, 2026  </w:t>
@@ -766,6 +900,12 @@
       </w:r>
     </w:p>
     <w:sectPr>
+      <w:headerReference w:type="even" r:id="rId11"/>
+      <w:headerReference w:type="default" r:id="rId12"/>
+      <w:footerReference w:type="even" r:id="rId13"/>
+      <w:footerReference w:type="default" r:id="rId14"/>
+      <w:headerReference w:type="first" r:id="rId15"/>
+      <w:footerReference w:type="first" r:id="rId16"/>
       <w:pgSz w:w="12240" w:h="15840"/>
       <w:pgMar w:top="1440" w:right="1440" w:bottom="1440" w:left="1440" w:header="720" w:footer="720" w:gutter="0"/>
       <w:cols w:space="720"/>
@@ -773,6 +913,145 @@
     </w:sectPr>
   </w:body>
 </w:document>
+</file>
+
+<file path=word/endnotes.xml><?xml version="1.0" encoding="utf-8"?>
+<w:endnotes xmlns:wpc="http://schemas.microsoft.com/office/word/2010/wordprocessingCanvas" xmlns:cx="http://schemas.microsoft.com/office/drawing/2014/chartex" xmlns:cx1="http://schemas.microsoft.com/office/drawing/2015/9/8/chartex" xmlns:cx2="http://schemas.microsoft.com/office/drawing/2015/10/21/chartex" xmlns:cx3="http://schemas.microsoft.com/office/drawing/2016/5/9/chartex" xmlns:cx4="http://schemas.microsoft.com/office/drawing/2016/5/10/chartex" xmlns:cx5="http://schemas.microsoft.com/office/drawing/2016/5/11/chartex" xmlns:cx6="http://schemas.microsoft.com/office/drawing/2016/5/12/chartex" xmlns:cx7="http://schemas.microsoft.com/office/drawing/2016/5/13/chartex" xmlns:cx8="http://schemas.microsoft.com/office/drawing/2016/5/14/chartex" xmlns:mc="http://schemas.openxmlformats.org/markup-compatibility/2006" xmlns:aink="http://schemas.microsoft.com/office/drawing/2016/ink" xmlns:am3d="http://schemas.microsoft.com/office/drawing/2017/model3d" xmlns:o="urn:schemas-microsoft-com:office:office" xmlns:oel="http://schemas.microsoft.com/office/2019/extlst" xmlns:r="http://schemas.openxmlformats.org/officeDocument/2006/relationships" xmlns:m="http://schemas.openxmlformats.org/officeDocument/2006/math" xmlns:v="urn:schemas-microsoft-com:vml" xmlns:wp14="http://schemas.microsoft.com/office/word/2010/wordprocessingDrawing" xmlns:wp="http://schemas.openxmlformats.org/drawingml/2006/wordprocessingDrawing" xmlns:w10="urn:schemas-microsoft-com:office:word" xmlns:w="http://schemas.openxmlformats.org/wordprocessingml/2006/main" xmlns:w14="http://schemas.microsoft.com/office/word/2010/wordml" xmlns:w15="http://schemas.microsoft.com/office/word/2012/wordml" xmlns:w16cex="http://schemas.microsoft.com/office/word/2018/wordml/cex" xmlns:w16cid="http://schemas.microsoft.com/office/word/2016/wordml/cid" xmlns:w16="http://schemas.microsoft.com/office/word/2018/wordml" xmlns:w16du="http://schemas.microsoft.com/office/word/2023/wordml/word16du" xmlns:w16sdtdh="http://schemas.microsoft.com/office/word/2020/wordml/sdtdatahash" xmlns:w16sdtfl="http://schemas.microsoft.com/office/word/2024/wordml/sdtformatlock" xmlns:w16se="http://schemas.microsoft.com/office/word/2015/wordml/symex" xmlns:wpg="http://schemas.microsoft.com/office/word/2010/wordprocessingGroup" xmlns:wpi="http://schemas.microsoft.com/office/word/2010/wordprocessingInk" xmlns:wne="http://schemas.microsoft.com/office/word/2006/wordml" xmlns:wps="http://schemas.microsoft.com/office/word/2010/wordprocessingShape" mc:Ignorable="w14 w15 w16se w16cid w16 w16cex w16sdtdh w16sdtfl w16du wp14">
+  <w:endnote w:type="separator" w:id="-1">
+    <w:p>
+      <w:pPr>
+        <w:spacing w:after="0" w:line="240" w:lineRule="auto"/>
+      </w:pPr>
+      <w:r>
+        <w:separator/>
+      </w:r>
+    </w:p>
+  </w:endnote>
+  <w:endnote w:type="continuationSeparator" w:id="0">
+    <w:p>
+      <w:pPr>
+        <w:spacing w:after="0" w:line="240" w:lineRule="auto"/>
+      </w:pPr>
+      <w:r>
+        <w:continuationSeparator/>
+      </w:r>
+    </w:p>
+  </w:endnote>
+</w:endnotes>
+</file>
+
+<file path=word/footer1.xml><?xml version="1.0" encoding="utf-8"?>
+<w:ftr xmlns:wpc="http://schemas.microsoft.com/office/word/2010/wordprocessingCanvas" xmlns:cx="http://schemas.microsoft.com/office/drawing/2014/chartex" xmlns:cx1="http://schemas.microsoft.com/office/drawing/2015/9/8/chartex" xmlns:cx2="http://schemas.microsoft.com/office/drawing/2015/10/21/chartex" xmlns:cx3="http://schemas.microsoft.com/office/drawing/2016/5/9/chartex" xmlns:cx4="http://schemas.microsoft.com/office/drawing/2016/5/10/chartex" xmlns:cx5="http://schemas.microsoft.com/office/drawing/2016/5/11/chartex" xmlns:cx6="http://schemas.microsoft.com/office/drawing/2016/5/12/chartex" xmlns:cx7="http://schemas.microsoft.com/office/drawing/2016/5/13/chartex" xmlns:cx8="http://schemas.microsoft.com/office/drawing/2016/5/14/chartex" xmlns:mc="http://schemas.openxmlformats.org/markup-compatibility/2006" xmlns:aink="http://schemas.microsoft.com/office/drawing/2016/ink" xmlns:am3d="http://schemas.microsoft.com/office/drawing/2017/model3d" xmlns:o="urn:schemas-microsoft-com:office:office" xmlns:oel="http://schemas.microsoft.com/office/2019/extlst" xmlns:r="http://schemas.openxmlformats.org/officeDocument/2006/relationships" xmlns:m="http://schemas.openxmlformats.org/officeDocument/2006/math" xmlns:v="urn:schemas-microsoft-com:vml" xmlns:wp14="http://schemas.microsoft.com/office/word/2010/wordprocessingDrawing" xmlns:wp="http://schemas.openxmlformats.org/drawingml/2006/wordprocessingDrawing" xmlns:w10="urn:schemas-microsoft-com:office:word" xmlns:w="http://schemas.openxmlformats.org/wordprocessingml/2006/main" xmlns:w14="http://schemas.microsoft.com/office/word/2010/wordml" xmlns:w15="http://schemas.microsoft.com/office/word/2012/wordml" xmlns:w16cex="http://schemas.microsoft.com/office/word/2018/wordml/cex" xmlns:w16cid="http://schemas.microsoft.com/office/word/2016/wordml/cid" xmlns:w16="http://schemas.microsoft.com/office/word/2018/wordml" xmlns:w16du="http://schemas.microsoft.com/office/word/2023/wordml/word16du" xmlns:w16sdtdh="http://schemas.microsoft.com/office/word/2020/wordml/sdtdatahash" xmlns:w16sdtfl="http://schemas.microsoft.com/office/word/2024/wordml/sdtformatlock" xmlns:w16se="http://schemas.microsoft.com/office/word/2015/wordml/symex" xmlns:wpg="http://schemas.microsoft.com/office/word/2010/wordprocessingGroup" xmlns:wpi="http://schemas.microsoft.com/office/word/2010/wordprocessingInk" xmlns:wne="http://schemas.microsoft.com/office/word/2006/wordml" xmlns:wps="http://schemas.microsoft.com/office/word/2010/wordprocessingShape" mc:Ignorable="w14 w15 w16se w16cid w16 w16cex w16sdtdh w16sdtfl w16du wp14">
+  <w:p>
+    <w:pPr>
+      <w:pStyle w:val="Footer"/>
+    </w:pPr>
+  </w:p>
+</w:ftr>
+</file>
+
+<file path=word/footer2.xml><?xml version="1.0" encoding="utf-8"?>
+<w:ftr xmlns:wpc="http://schemas.microsoft.com/office/word/2010/wordprocessingCanvas" xmlns:cx="http://schemas.microsoft.com/office/drawing/2014/chartex" xmlns:cx1="http://schemas.microsoft.com/office/drawing/2015/9/8/chartex" xmlns:cx2="http://schemas.microsoft.com/office/drawing/2015/10/21/chartex" xmlns:cx3="http://schemas.microsoft.com/office/drawing/2016/5/9/chartex" xmlns:cx4="http://schemas.microsoft.com/office/drawing/2016/5/10/chartex" xmlns:cx5="http://schemas.microsoft.com/office/drawing/2016/5/11/chartex" xmlns:cx6="http://schemas.microsoft.com/office/drawing/2016/5/12/chartex" xmlns:cx7="http://schemas.microsoft.com/office/drawing/2016/5/13/chartex" xmlns:cx8="http://schemas.microsoft.com/office/drawing/2016/5/14/chartex" xmlns:mc="http://schemas.openxmlformats.org/markup-compatibility/2006" xmlns:aink="http://schemas.microsoft.com/office/drawing/2016/ink" xmlns:am3d="http://schemas.microsoft.com/office/drawing/2017/model3d" xmlns:o="urn:schemas-microsoft-com:office:office" xmlns:oel="http://schemas.microsoft.com/office/2019/extlst" xmlns:r="http://schemas.openxmlformats.org/officeDocument/2006/relationships" xmlns:m="http://schemas.openxmlformats.org/officeDocument/2006/math" xmlns:v="urn:schemas-microsoft-com:vml" xmlns:wp14="http://schemas.microsoft.com/office/word/2010/wordprocessingDrawing" xmlns:wp="http://schemas.openxmlformats.org/drawingml/2006/wordprocessingDrawing" xmlns:w10="urn:schemas-microsoft-com:office:word" xmlns:w="http://schemas.openxmlformats.org/wordprocessingml/2006/main" xmlns:w14="http://schemas.microsoft.com/office/word/2010/wordml" xmlns:w15="http://schemas.microsoft.com/office/word/2012/wordml" xmlns:w16cex="http://schemas.microsoft.com/office/word/2018/wordml/cex" xmlns:w16cid="http://schemas.microsoft.com/office/word/2016/wordml/cid" xmlns:w16="http://schemas.microsoft.com/office/word/2018/wordml" xmlns:w16du="http://schemas.microsoft.com/office/word/2023/wordml/word16du" xmlns:w16sdtdh="http://schemas.microsoft.com/office/word/2020/wordml/sdtdatahash" xmlns:w16sdtfl="http://schemas.microsoft.com/office/word/2024/wordml/sdtformatlock" xmlns:w16se="http://schemas.microsoft.com/office/word/2015/wordml/symex" xmlns:wpg="http://schemas.microsoft.com/office/word/2010/wordprocessingGroup" xmlns:wpi="http://schemas.microsoft.com/office/word/2010/wordprocessingInk" xmlns:wne="http://schemas.microsoft.com/office/word/2006/wordml" xmlns:wps="http://schemas.microsoft.com/office/word/2010/wordprocessingShape" mc:Ignorable="w14 w15 w16se w16cid w16 w16cex w16sdtdh w16sdtfl w16du wp14">
+  <w:p>
+    <w:pPr>
+      <w:pStyle w:val="Footer"/>
+    </w:pPr>
+  </w:p>
+</w:ftr>
+</file>
+
+<file path=word/footer3.xml><?xml version="1.0" encoding="utf-8"?>
+<w:ftr xmlns:wpc="http://schemas.microsoft.com/office/word/2010/wordprocessingCanvas" xmlns:cx="http://schemas.microsoft.com/office/drawing/2014/chartex" xmlns:cx1="http://schemas.microsoft.com/office/drawing/2015/9/8/chartex" xmlns:cx2="http://schemas.microsoft.com/office/drawing/2015/10/21/chartex" xmlns:cx3="http://schemas.microsoft.com/office/drawing/2016/5/9/chartex" xmlns:cx4="http://schemas.microsoft.com/office/drawing/2016/5/10/chartex" xmlns:cx5="http://schemas.microsoft.com/office/drawing/2016/5/11/chartex" xmlns:cx6="http://schemas.microsoft.com/office/drawing/2016/5/12/chartex" xmlns:cx7="http://schemas.microsoft.com/office/drawing/2016/5/13/chartex" xmlns:cx8="http://schemas.microsoft.com/office/drawing/2016/5/14/chartex" xmlns:mc="http://schemas.openxmlformats.org/markup-compatibility/2006" xmlns:aink="http://schemas.microsoft.com/office/drawing/2016/ink" xmlns:am3d="http://schemas.microsoft.com/office/drawing/2017/model3d" xmlns:o="urn:schemas-microsoft-com:office:office" xmlns:oel="http://schemas.microsoft.com/office/2019/extlst" xmlns:r="http://schemas.openxmlformats.org/officeDocument/2006/relationships" xmlns:m="http://schemas.openxmlformats.org/officeDocument/2006/math" xmlns:v="urn:schemas-microsoft-com:vml" xmlns:wp14="http://schemas.microsoft.com/office/word/2010/wordprocessingDrawing" xmlns:wp="http://schemas.openxmlformats.org/drawingml/2006/wordprocessingDrawing" xmlns:w10="urn:schemas-microsoft-com:office:word" xmlns:w="http://schemas.openxmlformats.org/wordprocessingml/2006/main" xmlns:w14="http://schemas.microsoft.com/office/word/2010/wordml" xmlns:w15="http://schemas.microsoft.com/office/word/2012/wordml" xmlns:w16cex="http://schemas.microsoft.com/office/word/2018/wordml/cex" xmlns:w16cid="http://schemas.microsoft.com/office/word/2016/wordml/cid" xmlns:w16="http://schemas.microsoft.com/office/word/2018/wordml" xmlns:w16du="http://schemas.microsoft.com/office/word/2023/wordml/word16du" xmlns:w16sdtdh="http://schemas.microsoft.com/office/word/2020/wordml/sdtdatahash" xmlns:w16sdtfl="http://schemas.microsoft.com/office/word/2024/wordml/sdtformatlock" xmlns:w16se="http://schemas.microsoft.com/office/word/2015/wordml/symex" xmlns:wpg="http://schemas.microsoft.com/office/word/2010/wordprocessingGroup" xmlns:wpi="http://schemas.microsoft.com/office/word/2010/wordprocessingInk" xmlns:wne="http://schemas.microsoft.com/office/word/2006/wordml" xmlns:wps="http://schemas.microsoft.com/office/word/2010/wordprocessingShape" mc:Ignorable="w14 w15 w16se w16cid w16 w16cex w16sdtdh w16sdtfl w16du wp14">
+  <w:p>
+    <w:pPr>
+      <w:pStyle w:val="Footer"/>
+    </w:pPr>
+  </w:p>
+</w:ftr>
+</file>
+
+<file path=word/footnotes.xml><?xml version="1.0" encoding="utf-8"?>
+<w:footnotes xmlns:wpc="http://schemas.microsoft.com/office/word/2010/wordprocessingCanvas" xmlns:cx="http://schemas.microsoft.com/office/drawing/2014/chartex" xmlns:cx1="http://schemas.microsoft.com/office/drawing/2015/9/8/chartex" xmlns:cx2="http://schemas.microsoft.com/office/drawing/2015/10/21/chartex" xmlns:cx3="http://schemas.microsoft.com/office/drawing/2016/5/9/chartex" xmlns:cx4="http://schemas.microsoft.com/office/drawing/2016/5/10/chartex" xmlns:cx5="http://schemas.microsoft.com/office/drawing/2016/5/11/chartex" xmlns:cx6="http://schemas.microsoft.com/office/drawing/2016/5/12/chartex" xmlns:cx7="http://schemas.microsoft.com/office/drawing/2016/5/13/chartex" xmlns:cx8="http://schemas.microsoft.com/office/drawing/2016/5/14/chartex" xmlns:mc="http://schemas.openxmlformats.org/markup-compatibility/2006" xmlns:aink="http://schemas.microsoft.com/office/drawing/2016/ink" xmlns:am3d="http://schemas.microsoft.com/office/drawing/2017/model3d" xmlns:o="urn:schemas-microsoft-com:office:office" xmlns:oel="http://schemas.microsoft.com/office/2019/extlst" xmlns:r="http://schemas.openxmlformats.org/officeDocument/2006/relationships" xmlns:m="http://schemas.openxmlformats.org/officeDocument/2006/math" xmlns:v="urn:schemas-microsoft-com:vml" xmlns:wp14="http://schemas.microsoft.com/office/word/2010/wordprocessingDrawing" xmlns:wp="http://schemas.openxmlformats.org/drawingml/2006/wordprocessingDrawing" xmlns:w10="urn:schemas-microsoft-com:office:word" xmlns:w="http://schemas.openxmlformats.org/wordprocessingml/2006/main" xmlns:w14="http://schemas.microsoft.com/office/word/2010/wordml" xmlns:w15="http://schemas.microsoft.com/office/word/2012/wordml" xmlns:w16cex="http://schemas.microsoft.com/office/word/2018/wordml/cex" xmlns:w16cid="http://schemas.microsoft.com/office/word/2016/wordml/cid" xmlns:w16="http://schemas.microsoft.com/office/word/2018/wordml" xmlns:w16du="http://schemas.microsoft.com/office/word/2023/wordml/word16du" xmlns:w16sdtdh="http://schemas.microsoft.com/office/word/2020/wordml/sdtdatahash" xmlns:w16sdtfl="http://schemas.microsoft.com/office/word/2024/wordml/sdtformatlock" xmlns:w16se="http://schemas.microsoft.com/office/word/2015/wordml/symex" xmlns:wpg="http://schemas.microsoft.com/office/word/2010/wordprocessingGroup" xmlns:wpi="http://schemas.microsoft.com/office/word/2010/wordprocessingInk" xmlns:wne="http://schemas.microsoft.com/office/word/2006/wordml" xmlns:wps="http://schemas.microsoft.com/office/word/2010/wordprocessingShape" mc:Ignorable="w14 w15 w16se w16cid w16 w16cex w16sdtdh w16sdtfl w16du wp14">
+  <w:footnote w:type="separator" w:id="-1">
+    <w:p>
+      <w:pPr>
+        <w:spacing w:after="0" w:line="240" w:lineRule="auto"/>
+      </w:pPr>
+      <w:r>
+        <w:separator/>
+      </w:r>
+    </w:p>
+  </w:footnote>
+  <w:footnote w:type="continuationSeparator" w:id="0">
+    <w:p>
+      <w:pPr>
+        <w:spacing w:after="0" w:line="240" w:lineRule="auto"/>
+      </w:pPr>
+      <w:r>
+        <w:continuationSeparator/>
+      </w:r>
+    </w:p>
+  </w:footnote>
+</w:footnotes>
+</file>
+
+<file path=word/header1.xml><?xml version="1.0" encoding="utf-8"?>
+<w:hdr xmlns:wpc="http://schemas.microsoft.com/office/word/2010/wordprocessingCanvas" xmlns:cx="http://schemas.microsoft.com/office/drawing/2014/chartex" xmlns:cx1="http://schemas.microsoft.com/office/drawing/2015/9/8/chartex" xmlns:cx2="http://schemas.microsoft.com/office/drawing/2015/10/21/chartex" xmlns:cx3="http://schemas.microsoft.com/office/drawing/2016/5/9/chartex" xmlns:cx4="http://schemas.microsoft.com/office/drawing/2016/5/10/chartex" xmlns:cx5="http://schemas.microsoft.com/office/drawing/2016/5/11/chartex" xmlns:cx6="http://schemas.microsoft.com/office/drawing/2016/5/12/chartex" xmlns:cx7="http://schemas.microsoft.com/office/drawing/2016/5/13/chartex" xmlns:cx8="http://schemas.microsoft.com/office/drawing/2016/5/14/chartex" xmlns:mc="http://schemas.openxmlformats.org/markup-compatibility/2006" xmlns:aink="http://schemas.microsoft.com/office/drawing/2016/ink" xmlns:am3d="http://schemas.microsoft.com/office/drawing/2017/model3d" xmlns:o="urn:schemas-microsoft-com:office:office" xmlns:oel="http://schemas.microsoft.com/office/2019/extlst" xmlns:r="http://schemas.openxmlformats.org/officeDocument/2006/relationships" xmlns:m="http://schemas.openxmlformats.org/officeDocument/2006/math" xmlns:v="urn:schemas-microsoft-com:vml" xmlns:wp14="http://schemas.microsoft.com/office/word/2010/wordprocessingDrawing" xmlns:wp="http://schemas.openxmlformats.org/drawingml/2006/wordprocessingDrawing" xmlns:w10="urn:schemas-microsoft-com:office:word" xmlns:w="http://schemas.openxmlformats.org/wordprocessingml/2006/main" xmlns:w14="http://schemas.microsoft.com/office/word/2010/wordml" xmlns:w15="http://schemas.microsoft.com/office/word/2012/wordml" xmlns:w16cex="http://schemas.microsoft.com/office/word/2018/wordml/cex" xmlns:w16cid="http://schemas.microsoft.com/office/word/2016/wordml/cid" xmlns:w16="http://schemas.microsoft.com/office/word/2018/wordml" xmlns:w16du="http://schemas.microsoft.com/office/word/2023/wordml/word16du" xmlns:w16sdtdh="http://schemas.microsoft.com/office/word/2020/wordml/sdtdatahash" xmlns:w16sdtfl="http://schemas.microsoft.com/office/word/2024/wordml/sdtformatlock" xmlns:w16se="http://schemas.microsoft.com/office/word/2015/wordml/symex" xmlns:wpg="http://schemas.microsoft.com/office/word/2010/wordprocessingGroup" xmlns:wpi="http://schemas.microsoft.com/office/word/2010/wordprocessingInk" xmlns:wne="http://schemas.microsoft.com/office/word/2006/wordml" xmlns:wps="http://schemas.microsoft.com/office/word/2010/wordprocessingShape" mc:Ignorable="w14 w15 w16se w16cid w16 w16cex w16sdtdh w16sdtfl w16du wp14">
+  <w:p>
+    <w:pPr>
+      <w:pStyle w:val="Header"/>
+    </w:pPr>
+  </w:p>
+</w:hdr>
+</file>
+
+<file path=word/header2.xml><?xml version="1.0" encoding="utf-8"?>
+<w:hdr xmlns:wpc="http://schemas.microsoft.com/office/word/2010/wordprocessingCanvas" xmlns:cx="http://schemas.microsoft.com/office/drawing/2014/chartex" xmlns:cx1="http://schemas.microsoft.com/office/drawing/2015/9/8/chartex" xmlns:cx2="http://schemas.microsoft.com/office/drawing/2015/10/21/chartex" xmlns:cx3="http://schemas.microsoft.com/office/drawing/2016/5/9/chartex" xmlns:cx4="http://schemas.microsoft.com/office/drawing/2016/5/10/chartex" xmlns:cx5="http://schemas.microsoft.com/office/drawing/2016/5/11/chartex" xmlns:cx6="http://schemas.microsoft.com/office/drawing/2016/5/12/chartex" xmlns:cx7="http://schemas.microsoft.com/office/drawing/2016/5/13/chartex" xmlns:cx8="http://schemas.microsoft.com/office/drawing/2016/5/14/chartex" xmlns:mc="http://schemas.openxmlformats.org/markup-compatibility/2006" xmlns:aink="http://schemas.microsoft.com/office/drawing/2016/ink" xmlns:am3d="http://schemas.microsoft.com/office/drawing/2017/model3d" xmlns:o="urn:schemas-microsoft-com:office:office" xmlns:oel="http://schemas.microsoft.com/office/2019/extlst" xmlns:r="http://schemas.openxmlformats.org/officeDocument/2006/relationships" xmlns:m="http://schemas.openxmlformats.org/officeDocument/2006/math" xmlns:v="urn:schemas-microsoft-com:vml" xmlns:wp14="http://schemas.microsoft.com/office/word/2010/wordprocessingDrawing" xmlns:wp="http://schemas.openxmlformats.org/drawingml/2006/wordprocessingDrawing" xmlns:w10="urn:schemas-microsoft-com:office:word" xmlns:w="http://schemas.openxmlformats.org/wordprocessingml/2006/main" xmlns:w14="http://schemas.microsoft.com/office/word/2010/wordml" xmlns:w15="http://schemas.microsoft.com/office/word/2012/wordml" xmlns:w16cex="http://schemas.microsoft.com/office/word/2018/wordml/cex" xmlns:w16cid="http://schemas.microsoft.com/office/word/2016/wordml/cid" xmlns:w16="http://schemas.microsoft.com/office/word/2018/wordml" xmlns:w16du="http://schemas.microsoft.com/office/word/2023/wordml/word16du" xmlns:w16sdtdh="http://schemas.microsoft.com/office/word/2020/wordml/sdtdatahash" xmlns:w16sdtfl="http://schemas.microsoft.com/office/word/2024/wordml/sdtformatlock" xmlns:w16se="http://schemas.microsoft.com/office/word/2015/wordml/symex" xmlns:wpg="http://schemas.microsoft.com/office/word/2010/wordprocessingGroup" xmlns:wpi="http://schemas.microsoft.com/office/word/2010/wordprocessingInk" xmlns:wne="http://schemas.microsoft.com/office/word/2006/wordml" xmlns:wps="http://schemas.microsoft.com/office/word/2010/wordprocessingShape" mc:Ignorable="w14 w15 w16se w16cid w16 w16cex w16sdtdh w16sdtfl w16du wp14">
+  <w:p>
+    <w:pPr>
+      <w:pStyle w:val="Header"/>
+    </w:pPr>
+  </w:p>
+</w:hdr>
+</file>
+
+<file path=word/header3.xml><?xml version="1.0" encoding="utf-8"?>
+<w:hdr xmlns:wpc="http://schemas.microsoft.com/office/word/2010/wordprocessingCanvas" xmlns:cx="http://schemas.microsoft.com/office/drawing/2014/chartex" xmlns:cx1="http://schemas.microsoft.com/office/drawing/2015/9/8/chartex" xmlns:cx2="http://schemas.microsoft.com/office/drawing/2015/10/21/chartex" xmlns:cx3="http://schemas.microsoft.com/office/drawing/2016/5/9/chartex" xmlns:cx4="http://schemas.microsoft.com/office/drawing/2016/5/10/chartex" xmlns:cx5="http://schemas.microsoft.com/office/drawing/2016/5/11/chartex" xmlns:cx6="http://schemas.microsoft.com/office/drawing/2016/5/12/chartex" xmlns:cx7="http://schemas.microsoft.com/office/drawing/2016/5/13/chartex" xmlns:cx8="http://schemas.microsoft.com/office/drawing/2016/5/14/chartex" xmlns:mc="http://schemas.openxmlformats.org/markup-compatibility/2006" xmlns:aink="http://schemas.microsoft.com/office/drawing/2016/ink" xmlns:am3d="http://schemas.microsoft.com/office/drawing/2017/model3d" xmlns:o="urn:schemas-microsoft-com:office:office" xmlns:oel="http://schemas.microsoft.com/office/2019/extlst" xmlns:r="http://schemas.openxmlformats.org/officeDocument/2006/relationships" xmlns:m="http://schemas.openxmlformats.org/officeDocument/2006/math" xmlns:v="urn:schemas-microsoft-com:vml" xmlns:wp14="http://schemas.microsoft.com/office/word/2010/wordprocessingDrawing" xmlns:wp="http://schemas.openxmlformats.org/drawingml/2006/wordprocessingDrawing" xmlns:w10="urn:schemas-microsoft-com:office:word" xmlns:w="http://schemas.openxmlformats.org/wordprocessingml/2006/main" xmlns:w14="http://schemas.microsoft.com/office/word/2010/wordml" xmlns:w15="http://schemas.microsoft.com/office/word/2012/wordml" xmlns:w16cex="http://schemas.microsoft.com/office/word/2018/wordml/cex" xmlns:w16cid="http://schemas.microsoft.com/office/word/2016/wordml/cid" xmlns:w16="http://schemas.microsoft.com/office/word/2018/wordml" xmlns:w16du="http://schemas.microsoft.com/office/word/2023/wordml/word16du" xmlns:w16sdtdh="http://schemas.microsoft.com/office/word/2020/wordml/sdtdatahash" xmlns:w16sdtfl="http://schemas.microsoft.com/office/word/2024/wordml/sdtformatlock" xmlns:w16se="http://schemas.microsoft.com/office/word/2015/wordml/symex" xmlns:wpg="http://schemas.microsoft.com/office/word/2010/wordprocessingGroup" xmlns:wpi="http://schemas.microsoft.com/office/word/2010/wordprocessingInk" xmlns:wne="http://schemas.microsoft.com/office/word/2006/wordml" xmlns:wps="http://schemas.microsoft.com/office/word/2010/wordprocessingShape" mc:Ignorable="w14 w15 w16se w16cid w16 w16cex w16sdtdh w16sdtfl w16du wp14">
+  <w:p>
+    <w:pPr>
+      <w:pStyle w:val="Header"/>
+    </w:pPr>
+  </w:p>
+</w:hdr>
+</file>
+
+<file path=word/numbering.xml><?xml version="1.0" encoding="utf-8"?>
+<w:numbering xmlns:wpc="http://schemas.microsoft.com/office/word/2010/wordprocessingCanvas" xmlns:cx="http://schemas.microsoft.com/office/drawing/2014/chartex" xmlns:cx1="http://schemas.microsoft.com/office/drawing/2015/9/8/chartex" xmlns:cx2="http://schemas.microsoft.com/office/drawing/2015/10/21/chartex" xmlns:cx3="http://schemas.microsoft.com/office/drawing/2016/5/9/chartex" xmlns:cx4="http://schemas.microsoft.com/office/drawing/2016/5/10/chartex" xmlns:cx5="http://schemas.microsoft.com/office/drawing/2016/5/11/chartex" xmlns:cx6="http://schemas.microsoft.com/office/drawing/2016/5/12/chartex" xmlns:cx7="http://schemas.microsoft.com/office/drawing/2016/5/13/chartex" xmlns:cx8="http://schemas.microsoft.com/office/drawing/2016/5/14/chartex" xmlns:mc="http://schemas.openxmlformats.org/markup-compatibility/2006" xmlns:aink="http://schemas.microsoft.com/office/drawing/2016/ink" xmlns:am3d="http://schemas.microsoft.com/office/drawing/2017/model3d" xmlns:o="urn:schemas-microsoft-com:office:office" xmlns:oel="http://schemas.microsoft.com/office/2019/extlst" xmlns:r="http://schemas.openxmlformats.org/officeDocument/2006/relationships" xmlns:m="http://schemas.openxmlformats.org/officeDocument/2006/math" xmlns:v="urn:schemas-microsoft-com:vml" xmlns:wp14="http://schemas.microsoft.com/office/word/2010/wordprocessingDrawing" xmlns:wp="http://schemas.openxmlformats.org/drawingml/2006/wordprocessingDrawing" xmlns:w10="urn:schemas-microsoft-com:office:word" xmlns:w="http://schemas.openxmlformats.org/wordprocessingml/2006/main" xmlns:w14="http://schemas.microsoft.com/office/word/2010/wordml" xmlns:w15="http://schemas.microsoft.com/office/word/2012/wordml" xmlns:w16cex="http://schemas.microsoft.com/office/word/2018/wordml/cex" xmlns:w16cid="http://schemas.microsoft.com/office/word/2016/wordml/cid" xmlns:w16="http://schemas.microsoft.com/office/word/2018/wordml" xmlns:w16du="http://schemas.microsoft.com/office/word/2023/wordml/word16du" xmlns:w16sdtdh="http://schemas.microsoft.com/office/word/2020/wordml/sdtdatahash" xmlns:w16sdtfl="http://schemas.microsoft.com/office/word/2024/wordml/sdtformatlock" xmlns:w16se="http://schemas.microsoft.com/office/word/2015/wordml/symex" xmlns:wpg="http://schemas.microsoft.com/office/word/2010/wordprocessingGroup" xmlns:wpi="http://schemas.microsoft.com/office/word/2010/wordprocessingInk" xmlns:wne="http://schemas.microsoft.com/office/word/2006/wordml" xmlns:wps="http://schemas.microsoft.com/office/word/2010/wordprocessingShape" mc:Ignorable="w14 w15 w16se w16cid w16 w16cex w16sdtdh w16sdtfl w16du wp14">
+  <w:abstractNum w:abstractNumId="0" w15:restartNumberingAfterBreak="0">
+    <w:nsid w:val="FFFFFF89"/>
+    <w:multiLevelType w:val="singleLevel"/>
+    <w:tmpl w:val="9C62CCF0"/>
+    <w:lvl w:ilvl="0">
+      <w:start w:val="1"/>
+      <w:numFmt w:val="bullet"/>
+      <w:pStyle w:val="ListBullet"/>
+      <w:lvlText w:val=""/>
+      <w:lvlJc w:val="left"/>
+      <w:pPr>
+        <w:tabs>
+          <w:tab w:val="num" w:pos="360"/>
+        </w:tabs>
+        <w:ind w:left="360" w:hanging="360"/>
+      </w:pPr>
+      <w:rPr>
+        <w:rFonts w:ascii="Symbol" w:hAnsi="Symbol" w:hint="default"/>
+      </w:rPr>
+    </w:lvl>
+  </w:abstractNum>
+  <w:num w:numId="1" w16cid:durableId="1675066227">
+    <w:abstractNumId w:val="0"/>
+  </w:num>
+</w:numbering>
 </file>
 
 <file path=word/styles.xml><?xml version="1.0" encoding="utf-8"?>
@@ -1203,7 +1482,6 @@
     <w:next w:val="Normal"/>
     <w:link w:val="Heading2Char"/>
     <w:uiPriority w:val="9"/>
-    <w:semiHidden/>
     <w:unhideWhenUsed/>
     <w:qFormat/>
     <w:rsid w:val="00B864B0"/>
@@ -1420,7 +1698,6 @@
     <w:basedOn w:val="DefaultParagraphFont"/>
     <w:link w:val="Heading2"/>
     <w:uiPriority w:val="9"/>
-    <w:semiHidden/>
     <w:rsid w:val="00B864B0"/>
     <w:rPr>
       <w:rFonts w:asciiTheme="majorHAnsi" w:eastAsiaTheme="majorEastAsia" w:hAnsiTheme="majorHAnsi" w:cstheme="majorBidi"/>
@@ -1713,6 +1990,82 @@
     <w:rPr>
       <w:color w:val="605E5C"/>
       <w:shd w:val="clear" w:color="auto" w:fill="E1DFDD"/>
+    </w:rPr>
+  </w:style>
+  <w:style w:type="paragraph" w:styleId="Header">
+    <w:name w:val="header"/>
+    <w:basedOn w:val="Normal"/>
+    <w:link w:val="HeaderChar"/>
+    <w:uiPriority w:val="99"/>
+    <w:unhideWhenUsed/>
+    <w:rsid w:val="00730953"/>
+    <w:pPr>
+      <w:tabs>
+        <w:tab w:val="center" w:pos="4680"/>
+        <w:tab w:val="right" w:pos="9360"/>
+      </w:tabs>
+      <w:spacing w:after="0" w:line="240" w:lineRule="auto"/>
+    </w:pPr>
+  </w:style>
+  <w:style w:type="character" w:customStyle="1" w:styleId="HeaderChar">
+    <w:name w:val="Header Char"/>
+    <w:basedOn w:val="DefaultParagraphFont"/>
+    <w:link w:val="Header"/>
+    <w:uiPriority w:val="99"/>
+    <w:rsid w:val="00730953"/>
+  </w:style>
+  <w:style w:type="paragraph" w:styleId="Footer">
+    <w:name w:val="footer"/>
+    <w:basedOn w:val="Normal"/>
+    <w:link w:val="FooterChar"/>
+    <w:uiPriority w:val="99"/>
+    <w:unhideWhenUsed/>
+    <w:rsid w:val="00730953"/>
+    <w:pPr>
+      <w:tabs>
+        <w:tab w:val="center" w:pos="4680"/>
+        <w:tab w:val="right" w:pos="9360"/>
+      </w:tabs>
+      <w:spacing w:after="0" w:line="240" w:lineRule="auto"/>
+    </w:pPr>
+  </w:style>
+  <w:style w:type="character" w:customStyle="1" w:styleId="FooterChar">
+    <w:name w:val="Footer Char"/>
+    <w:basedOn w:val="DefaultParagraphFont"/>
+    <w:link w:val="Footer"/>
+    <w:uiPriority w:val="99"/>
+    <w:rsid w:val="00730953"/>
+  </w:style>
+  <w:style w:type="paragraph" w:styleId="ListBullet">
+    <w:name w:val="List Bullet"/>
+    <w:basedOn w:val="Normal"/>
+    <w:uiPriority w:val="99"/>
+    <w:unhideWhenUsed/>
+    <w:rsid w:val="00730953"/>
+    <w:pPr>
+      <w:numPr>
+        <w:numId w:val="1"/>
+      </w:numPr>
+      <w:contextualSpacing/>
+    </w:pPr>
+  </w:style>
+  <w:style w:type="paragraph" w:styleId="Caption">
+    <w:name w:val="caption"/>
+    <w:basedOn w:val="Normal"/>
+    <w:next w:val="Normal"/>
+    <w:uiPriority w:val="35"/>
+    <w:unhideWhenUsed/>
+    <w:qFormat/>
+    <w:rsid w:val="00730953"/>
+    <w:pPr>
+      <w:spacing w:after="200" w:line="240" w:lineRule="auto"/>
+    </w:pPr>
+    <w:rPr>
+      <w:i/>
+      <w:iCs/>
+      <w:color w:val="44546A" w:themeColor="text2"/>
+      <w:sz w:val="18"/>
+      <w:szCs w:val="18"/>
     </w:rPr>
   </w:style>
 </w:styles>
@@ -2011,4 +2364,26 @@
     </a:ext>
   </a:extLst>
 </a:theme>
+</file>
+
+<file path=word/webextensions/taskpanes.xml><?xml version="1.0" encoding="utf-8"?>
+<wetp:taskpanes xmlns:wetp="http://schemas.microsoft.com/office/webextensions/taskpanes/2010/11">
+  <wetp:taskpane dockstate="right" visibility="0" width="350" row="0">
+    <wetp:webextensionref xmlns:r="http://schemas.openxmlformats.org/officeDocument/2006/relationships" r:id="rId1"/>
+  </wetp:taskpane>
+</wetp:taskpanes>
+</file>
+
+<file path=word/webextensions/webextension1.xml><?xml version="1.0" encoding="utf-8"?>
+<we:webextension xmlns:we="http://schemas.microsoft.com/office/webextensions/webextension/2010/11" id="{18629F3B-F663-40E9-A720-9C7B78F56446}">
+  <we:reference id="wa200010453" version="1.0.0.1" store="en-US" storeType="OMEX"/>
+  <we:alternateReferences>
+    <we:reference id="WA200010453" version="1.0.0.1" store="" storeType="OMEX"/>
+  </we:alternateReferences>
+  <we:properties>
+    <we:property name="claude.fileId" value="&quot;d8504ae5-cfbc-44d6-b874-0d5ac8c0e62f&quot;"/>
+  </we:properties>
+  <we:bindings/>
+  <we:snapshot xmlns:r="http://schemas.openxmlformats.org/officeDocument/2006/relationships"/>
+</we:webextension>
 </file>
</xml_diff>

<commit_message>
NIW evidence: add Exhibit 15 (research progress/body of work) + mark papers under review
- Exhibit 15: cumulative NIW exhibit quantifying the full body of work and headlining
  the three manuscripts now under peer review (Identity->TMLR, OT/ICS+RegMap->ACM DTRAP).
  Generated by exhibits/build_exhibit15.py (all metrics measured from the repo).
- Exhibits 11/12/13 + the Project Include narrative: dated "under peer review" update
  notes added via exhibits/apply_review_updates.py (idempotent; originals backed up locally).
</commit_message>
<xml_diff>
--- a/exhibits/Exhibit 12_hybrid _indentity.md.docx
+++ b/exhibits/Exhibit 12_hybrid _indentity.md.docx
@@ -88,6 +88,21 @@
       </w:r>
       <w:r>
         <w:t>s first research pathway.</w:t>
+      </w:r>
+    </w:p>
+    <w:p>
+      <w:r>
+        <w:rPr>
+          <w:b/>
+          <w:i/>
+        </w:rPr>
+        <w:t xml:space="preserve">Update (July 2026): </w:t>
+      </w:r>
+      <w:r>
+        <w:rPr>
+          <w:i/>
+        </w:rPr>
+        <w:t>This work has since been developed into a full scientific manuscript, “Access Breadth as a Robust Signal for Credential-Based Lateral Movement: A Red-Team Feature-Attribution Study on the LANL Dataset,” which is now under peer review at Transactions on Machine Learning Research (TMLR). The manuscript evaluates the detector against the LANL red-team ground truth—a rare source of real, labelled attack activity—with bootstrap confidence intervals and a full feature-attribution analysis. A consolidated record of this and the related research progress is provided in Exhibit 15.</w:t>
       </w:r>
     </w:p>
     <w:p/>

</xml_diff>